<commit_message>
feat(stories): play the 720 encode where the clip is drawn small
The player counts the device pixels the clip is drawn across (the viewport
width on a phone, the 432/900 card on a wider screen, times the pixel ratio)
and plays the 720x1280 files up to 800 of them, 1080x1920 above. A 2x phone
and a desktop card on an ordinary monitor get 720; 3x phones, MacBooks and 4K
screens get 1080. The choice follows the window, from the next slide on.

28 new files, 28-39% lighter than 1080 at the same quality floor. The site
guide describes both sizes and how to prepare the videos.

Co-Authored-By: Claude Opus 5.5 <noreply@anthropic.com>
</commit_message>
<xml_diff>
--- a/docs/POKER_STORY_INTEGRATION_UA.docx
+++ b/docs/POKER_STORY_INTEGRATION_UA.docx
@@ -3767,6 +3767,554 @@
         <w:rPr>
           <w:rFonts w:ascii="Arial" w:cs="Arial" w:eastAsia="Arial" w:hAnsi="Arial"/>
         </w:rPr>
+        <w:t xml:space="preserve">Розміри</w:t>
+      </w:r>
+    </w:p>
+    <w:p>
+      <w:pPr>
+        <w:spacing w:after="140" w:line="300"/>
+      </w:pPr>
+      <w:r>
+        <w:rPr>
+          <w:rFonts w:ascii="Arial" w:cs="Arial" w:eastAsia="Arial" w:hAnsi="Arial"/>
+          <w:sz w:val="22"/>
+          <w:szCs w:val="22"/>
+        </w:rPr>
+        <w:t xml:space="preserve">Кожне відео підготовлено у двох розмірах: 1080×1920 і 720×1280. Розмір обирається за кількістю фізичних пікселів, які відео займає на екрані:</w:t>
+      </w:r>
+    </w:p>
+    <w:p>
+      <w:pPr>
+        <w:pStyle w:val="ListParagraph"/>
+        <w:numPr>
+          <w:ilvl w:val="0"/>
+          <w:numId w:val="2"/>
+        </w:numPr>
+        <w:spacing w:after="60"/>
+      </w:pPr>
+      <w:r>
+        <w:rPr>
+          <w:rFonts w:ascii="Arial" w:cs="Arial" w:eastAsia="Arial" w:hAnsi="Arial"/>
+          <w:sz w:val="22"/>
+          <w:szCs w:val="22"/>
+        </w:rPr>
+        <w:t xml:space="preserve">на мобільному пристрої — ширина екрана, помножена на щільність пікселів;</w:t>
+      </w:r>
+    </w:p>
+    <w:p>
+      <w:pPr>
+        <w:pStyle w:val="ListParagraph"/>
+        <w:numPr>
+          <w:ilvl w:val="0"/>
+          <w:numId w:val="2"/>
+        </w:numPr>
+        <w:spacing w:after="60"/>
+      </w:pPr>
+      <w:r>
+        <w:rPr>
+          <w:rFonts w:ascii="Arial" w:cs="Arial" w:eastAsia="Arial" w:hAnsi="Arial"/>
+          <w:sz w:val="22"/>
+          <w:szCs w:val="22"/>
+        </w:rPr>
+        <w:t xml:space="preserve">на десктопі — ширина картки сторіс (432/900 висоти вікна), помножена на щільність пікселів.</w:t>
+      </w:r>
+    </w:p>
+    <w:p>
+      <w:pPr>
+        <w:spacing w:after="140" w:line="300"/>
+      </w:pPr>
+      <w:r>
+        <w:rPr>
+          <w:rFonts w:ascii="Arial" w:cs="Arial" w:eastAsia="Arial" w:hAnsi="Arial"/>
+          <w:sz w:val="22"/>
+          <w:szCs w:val="22"/>
+        </w:rPr>
+        <w:t xml:space="preserve">Якщо відео займає до 800 фізичних пікселів у ширину, відтворюється версія 720×1280, інакше — 1080×1920. Швидкість з'єднання на вибір не впливає.</w:t>
+      </w:r>
+    </w:p>
+    <w:tbl>
+      <w:tblPr>
+        <w:tblW w:type="dxa" w:w="9026"/>
+        <w:tblBorders>
+          <w:top w:val="single" w:color="auto" w:sz="4"/>
+          <w:left w:val="single" w:color="auto" w:sz="4"/>
+          <w:bottom w:val="single" w:color="auto" w:sz="4"/>
+          <w:right w:val="single" w:color="auto" w:sz="4"/>
+          <w:insideH w:val="single" w:color="auto" w:sz="4"/>
+          <w:insideV w:val="single" w:color="auto" w:sz="4"/>
+        </w:tblBorders>
+      </w:tblPr>
+      <w:tblGrid>
+        <w:gridCol w:w="4964"/>
+        <w:gridCol w:w="2513"/>
+        <w:gridCol w:w="1549"/>
+      </w:tblGrid>
+      <w:tr>
+        <w:trPr>
+          <w:tblHeader/>
+        </w:trPr>
+        <w:tc>
+          <w:tcPr>
+            <w:tcW w:type="dxa" w:w="4964"/>
+            <w:tcBorders>
+              <w:top w:val="single" w:color="BBBBBB" w:sz="4"/>
+              <w:left w:val="single" w:color="BBBBBB" w:sz="4"/>
+              <w:bottom w:val="single" w:color="BBBBBB" w:sz="4"/>
+              <w:right w:val="single" w:color="BBBBBB" w:sz="4"/>
+            </w:tcBorders>
+            <w:shd w:fill="E8EEF4" w:val="clear"/>
+            <w:tcMar>
+              <w:top w:type="dxa" w:w="70"/>
+              <w:left w:type="dxa" w:w="110"/>
+              <w:bottom w:type="dxa" w:w="70"/>
+              <w:right w:type="dxa" w:w="110"/>
+            </w:tcMar>
+          </w:tcPr>
+          <w:p>
+            <w:r>
+              <w:rPr>
+                <w:rFonts w:ascii="Arial" w:cs="Arial" w:eastAsia="Arial" w:hAnsi="Arial"/>
+                <w:b/>
+                <w:bCs/>
+                <w:sz w:val="20"/>
+                <w:szCs w:val="20"/>
+              </w:rPr>
+              <w:t xml:space="preserve">Пристрій</w:t>
+            </w:r>
+          </w:p>
+        </w:tc>
+        <w:tc>
+          <w:tcPr>
+            <w:tcW w:type="dxa" w:w="2513"/>
+            <w:tcBorders>
+              <w:top w:val="single" w:color="BBBBBB" w:sz="4"/>
+              <w:left w:val="single" w:color="BBBBBB" w:sz="4"/>
+              <w:bottom w:val="single" w:color="BBBBBB" w:sz="4"/>
+              <w:right w:val="single" w:color="BBBBBB" w:sz="4"/>
+            </w:tcBorders>
+            <w:shd w:fill="E8EEF4" w:val="clear"/>
+            <w:tcMar>
+              <w:top w:type="dxa" w:w="70"/>
+              <w:left w:type="dxa" w:w="110"/>
+              <w:bottom w:type="dxa" w:w="70"/>
+              <w:right w:type="dxa" w:w="110"/>
+            </w:tcMar>
+          </w:tcPr>
+          <w:p>
+            <w:r>
+              <w:rPr>
+                <w:rFonts w:ascii="Arial" w:cs="Arial" w:eastAsia="Arial" w:hAnsi="Arial"/>
+                <w:b/>
+                <w:bCs/>
+                <w:sz w:val="20"/>
+                <w:szCs w:val="20"/>
+              </w:rPr>
+              <w:t xml:space="preserve">Ширина відео на екрані</w:t>
+            </w:r>
+          </w:p>
+        </w:tc>
+        <w:tc>
+          <w:tcPr>
+            <w:tcW w:type="dxa" w:w="1549"/>
+            <w:tcBorders>
+              <w:top w:val="single" w:color="BBBBBB" w:sz="4"/>
+              <w:left w:val="single" w:color="BBBBBB" w:sz="4"/>
+              <w:bottom w:val="single" w:color="BBBBBB" w:sz="4"/>
+              <w:right w:val="single" w:color="BBBBBB" w:sz="4"/>
+            </w:tcBorders>
+            <w:shd w:fill="E8EEF4" w:val="clear"/>
+            <w:tcMar>
+              <w:top w:type="dxa" w:w="70"/>
+              <w:left w:type="dxa" w:w="110"/>
+              <w:bottom w:type="dxa" w:w="70"/>
+              <w:right w:type="dxa" w:w="110"/>
+            </w:tcMar>
+          </w:tcPr>
+          <w:p>
+            <w:r>
+              <w:rPr>
+                <w:rFonts w:ascii="Arial" w:cs="Arial" w:eastAsia="Arial" w:hAnsi="Arial"/>
+                <w:b/>
+                <w:bCs/>
+                <w:sz w:val="20"/>
+                <w:szCs w:val="20"/>
+              </w:rPr>
+              <w:t xml:space="preserve">Розмір файлу</w:t>
+            </w:r>
+          </w:p>
+        </w:tc>
+      </w:tr>
+      <w:tr>
+        <w:trPr>
+          <w:tblHeader w:val="off"/>
+        </w:trPr>
+        <w:tc>
+          <w:tcPr>
+            <w:tcW w:type="dxa" w:w="4964"/>
+            <w:tcBorders>
+              <w:top w:val="single" w:color="BBBBBB" w:sz="4"/>
+              <w:left w:val="single" w:color="BBBBBB" w:sz="4"/>
+              <w:bottom w:val="single" w:color="BBBBBB" w:sz="4"/>
+              <w:right w:val="single" w:color="BBBBBB" w:sz="4"/>
+            </w:tcBorders>
+            <w:tcMar>
+              <w:top w:type="dxa" w:w="70"/>
+              <w:left w:type="dxa" w:w="110"/>
+              <w:bottom w:type="dxa" w:w="70"/>
+              <w:right w:type="dxa" w:w="110"/>
+            </w:tcMar>
+          </w:tcPr>
+          <w:p>
+            <w:r>
+              <w:rPr>
+                <w:rFonts w:ascii="Arial" w:cs="Arial" w:eastAsia="Arial" w:hAnsi="Arial"/>
+                <w:sz w:val="20"/>
+                <w:szCs w:val="20"/>
+              </w:rPr>
+              <w:t xml:space="preserve">Телефон зі щільністю 2 (360×640, iPhone SE)</w:t>
+            </w:r>
+          </w:p>
+        </w:tc>
+        <w:tc>
+          <w:tcPr>
+            <w:tcW w:type="dxa" w:w="2513"/>
+            <w:tcBorders>
+              <w:top w:val="single" w:color="BBBBBB" w:sz="4"/>
+              <w:left w:val="single" w:color="BBBBBB" w:sz="4"/>
+              <w:bottom w:val="single" w:color="BBBBBB" w:sz="4"/>
+              <w:right w:val="single" w:color="BBBBBB" w:sz="4"/>
+            </w:tcBorders>
+            <w:tcMar>
+              <w:top w:type="dxa" w:w="70"/>
+              <w:left w:type="dxa" w:w="110"/>
+              <w:bottom w:type="dxa" w:w="70"/>
+              <w:right w:type="dxa" w:w="110"/>
+            </w:tcMar>
+          </w:tcPr>
+          <w:p>
+            <w:r>
+              <w:rPr>
+                <w:rFonts w:ascii="Arial" w:cs="Arial" w:eastAsia="Arial" w:hAnsi="Arial"/>
+                <w:sz w:val="20"/>
+                <w:szCs w:val="20"/>
+              </w:rPr>
+              <w:t xml:space="preserve">720–750 px</w:t>
+            </w:r>
+          </w:p>
+        </w:tc>
+        <w:tc>
+          <w:tcPr>
+            <w:tcW w:type="dxa" w:w="1549"/>
+            <w:tcBorders>
+              <w:top w:val="single" w:color="BBBBBB" w:sz="4"/>
+              <w:left w:val="single" w:color="BBBBBB" w:sz="4"/>
+              <w:bottom w:val="single" w:color="BBBBBB" w:sz="4"/>
+              <w:right w:val="single" w:color="BBBBBB" w:sz="4"/>
+            </w:tcBorders>
+            <w:tcMar>
+              <w:top w:type="dxa" w:w="70"/>
+              <w:left w:type="dxa" w:w="110"/>
+              <w:bottom w:type="dxa" w:w="70"/>
+              <w:right w:type="dxa" w:w="110"/>
+            </w:tcMar>
+          </w:tcPr>
+          <w:p>
+            <w:r>
+              <w:rPr>
+                <w:rFonts w:ascii="Arial" w:cs="Arial" w:eastAsia="Arial" w:hAnsi="Arial"/>
+                <w:sz w:val="20"/>
+                <w:szCs w:val="20"/>
+              </w:rPr>
+              <w:t xml:space="preserve">720</w:t>
+            </w:r>
+          </w:p>
+        </w:tc>
+      </w:tr>
+      <w:tr>
+        <w:trPr>
+          <w:tblHeader w:val="off"/>
+        </w:trPr>
+        <w:tc>
+          <w:tcPr>
+            <w:tcW w:type="dxa" w:w="4964"/>
+            <w:tcBorders>
+              <w:top w:val="single" w:color="BBBBBB" w:sz="4"/>
+              <w:left w:val="single" w:color="BBBBBB" w:sz="4"/>
+              <w:bottom w:val="single" w:color="BBBBBB" w:sz="4"/>
+              <w:right w:val="single" w:color="BBBBBB" w:sz="4"/>
+            </w:tcBorders>
+            <w:tcMar>
+              <w:top w:type="dxa" w:w="70"/>
+              <w:left w:type="dxa" w:w="110"/>
+              <w:bottom w:type="dxa" w:w="70"/>
+              <w:right w:type="dxa" w:w="110"/>
+            </w:tcMar>
+          </w:tcPr>
+          <w:p>
+            <w:r>
+              <w:rPr>
+                <w:rFonts w:ascii="Arial" w:cs="Arial" w:eastAsia="Arial" w:hAnsi="Arial"/>
+                <w:sz w:val="20"/>
+                <w:szCs w:val="20"/>
+              </w:rPr>
+              <w:t xml:space="preserve">Десктоп зі звичайним монітором (1440×900, 1920×1080)</w:t>
+            </w:r>
+          </w:p>
+        </w:tc>
+        <w:tc>
+          <w:tcPr>
+            <w:tcW w:type="dxa" w:w="2513"/>
+            <w:tcBorders>
+              <w:top w:val="single" w:color="BBBBBB" w:sz="4"/>
+              <w:left w:val="single" w:color="BBBBBB" w:sz="4"/>
+              <w:bottom w:val="single" w:color="BBBBBB" w:sz="4"/>
+              <w:right w:val="single" w:color="BBBBBB" w:sz="4"/>
+            </w:tcBorders>
+            <w:tcMar>
+              <w:top w:type="dxa" w:w="70"/>
+              <w:left w:type="dxa" w:w="110"/>
+              <w:bottom w:type="dxa" w:w="70"/>
+              <w:right w:type="dxa" w:w="110"/>
+            </w:tcMar>
+          </w:tcPr>
+          <w:p>
+            <w:r>
+              <w:rPr>
+                <w:rFonts w:ascii="Arial" w:cs="Arial" w:eastAsia="Arial" w:hAnsi="Arial"/>
+                <w:sz w:val="20"/>
+                <w:szCs w:val="20"/>
+              </w:rPr>
+              <w:t xml:space="preserve">430–520 px</w:t>
+            </w:r>
+          </w:p>
+        </w:tc>
+        <w:tc>
+          <w:tcPr>
+            <w:tcW w:type="dxa" w:w="1549"/>
+            <w:tcBorders>
+              <w:top w:val="single" w:color="BBBBBB" w:sz="4"/>
+              <w:left w:val="single" w:color="BBBBBB" w:sz="4"/>
+              <w:bottom w:val="single" w:color="BBBBBB" w:sz="4"/>
+              <w:right w:val="single" w:color="BBBBBB" w:sz="4"/>
+            </w:tcBorders>
+            <w:tcMar>
+              <w:top w:type="dxa" w:w="70"/>
+              <w:left w:type="dxa" w:w="110"/>
+              <w:bottom w:type="dxa" w:w="70"/>
+              <w:right w:type="dxa" w:w="110"/>
+            </w:tcMar>
+          </w:tcPr>
+          <w:p>
+            <w:r>
+              <w:rPr>
+                <w:rFonts w:ascii="Arial" w:cs="Arial" w:eastAsia="Arial" w:hAnsi="Arial"/>
+                <w:sz w:val="20"/>
+                <w:szCs w:val="20"/>
+              </w:rPr>
+              <w:t xml:space="preserve">720</w:t>
+            </w:r>
+          </w:p>
+        </w:tc>
+      </w:tr>
+      <w:tr>
+        <w:trPr>
+          <w:tblHeader w:val="off"/>
+        </w:trPr>
+        <w:tc>
+          <w:tcPr>
+            <w:tcW w:type="dxa" w:w="4964"/>
+            <w:tcBorders>
+              <w:top w:val="single" w:color="BBBBBB" w:sz="4"/>
+              <w:left w:val="single" w:color="BBBBBB" w:sz="4"/>
+              <w:bottom w:val="single" w:color="BBBBBB" w:sz="4"/>
+              <w:right w:val="single" w:color="BBBBBB" w:sz="4"/>
+            </w:tcBorders>
+            <w:tcMar>
+              <w:top w:type="dxa" w:w="70"/>
+              <w:left w:type="dxa" w:w="110"/>
+              <w:bottom w:type="dxa" w:w="70"/>
+              <w:right w:type="dxa" w:w="110"/>
+            </w:tcMar>
+          </w:tcPr>
+          <w:p>
+            <w:r>
+              <w:rPr>
+                <w:rFonts w:ascii="Arial" w:cs="Arial" w:eastAsia="Arial" w:hAnsi="Arial"/>
+                <w:sz w:val="20"/>
+                <w:szCs w:val="20"/>
+              </w:rPr>
+              <w:t xml:space="preserve">Сучасні iPhone і Android зі щільністю 3</w:t>
+            </w:r>
+          </w:p>
+        </w:tc>
+        <w:tc>
+          <w:tcPr>
+            <w:tcW w:type="dxa" w:w="2513"/>
+            <w:tcBorders>
+              <w:top w:val="single" w:color="BBBBBB" w:sz="4"/>
+              <w:left w:val="single" w:color="BBBBBB" w:sz="4"/>
+              <w:bottom w:val="single" w:color="BBBBBB" w:sz="4"/>
+              <w:right w:val="single" w:color="BBBBBB" w:sz="4"/>
+            </w:tcBorders>
+            <w:tcMar>
+              <w:top w:type="dxa" w:w="70"/>
+              <w:left w:type="dxa" w:w="110"/>
+              <w:bottom w:type="dxa" w:w="70"/>
+              <w:right w:type="dxa" w:w="110"/>
+            </w:tcMar>
+          </w:tcPr>
+          <w:p>
+            <w:r>
+              <w:rPr>
+                <w:rFonts w:ascii="Arial" w:cs="Arial" w:eastAsia="Arial" w:hAnsi="Arial"/>
+                <w:sz w:val="20"/>
+                <w:szCs w:val="20"/>
+              </w:rPr>
+              <w:t xml:space="preserve">1080–1320 px</w:t>
+            </w:r>
+          </w:p>
+        </w:tc>
+        <w:tc>
+          <w:tcPr>
+            <w:tcW w:type="dxa" w:w="1549"/>
+            <w:tcBorders>
+              <w:top w:val="single" w:color="BBBBBB" w:sz="4"/>
+              <w:left w:val="single" w:color="BBBBBB" w:sz="4"/>
+              <w:bottom w:val="single" w:color="BBBBBB" w:sz="4"/>
+              <w:right w:val="single" w:color="BBBBBB" w:sz="4"/>
+            </w:tcBorders>
+            <w:tcMar>
+              <w:top w:type="dxa" w:w="70"/>
+              <w:left w:type="dxa" w:w="110"/>
+              <w:bottom w:type="dxa" w:w="70"/>
+              <w:right w:type="dxa" w:w="110"/>
+            </w:tcMar>
+          </w:tcPr>
+          <w:p>
+            <w:r>
+              <w:rPr>
+                <w:rFonts w:ascii="Arial" w:cs="Arial" w:eastAsia="Arial" w:hAnsi="Arial"/>
+                <w:sz w:val="20"/>
+                <w:szCs w:val="20"/>
+              </w:rPr>
+              <w:t xml:space="preserve">1080</w:t>
+            </w:r>
+          </w:p>
+        </w:tc>
+      </w:tr>
+      <w:tr>
+        <w:trPr>
+          <w:tblHeader w:val="off"/>
+        </w:trPr>
+        <w:tc>
+          <w:tcPr>
+            <w:tcW w:type="dxa" w:w="4964"/>
+            <w:tcBorders>
+              <w:top w:val="single" w:color="BBBBBB" w:sz="4"/>
+              <w:left w:val="single" w:color="BBBBBB" w:sz="4"/>
+              <w:bottom w:val="single" w:color="BBBBBB" w:sz="4"/>
+              <w:right w:val="single" w:color="BBBBBB" w:sz="4"/>
+            </w:tcBorders>
+            <w:tcMar>
+              <w:top w:type="dxa" w:w="70"/>
+              <w:left w:type="dxa" w:w="110"/>
+              <w:bottom w:type="dxa" w:w="70"/>
+              <w:right w:type="dxa" w:w="110"/>
+            </w:tcMar>
+          </w:tcPr>
+          <w:p>
+            <w:r>
+              <w:rPr>
+                <w:rFonts w:ascii="Arial" w:cs="Arial" w:eastAsia="Arial" w:hAnsi="Arial"/>
+                <w:sz w:val="20"/>
+                <w:szCs w:val="20"/>
+              </w:rPr>
+              <w:t xml:space="preserve">MacBook, монітор 4K</w:t>
+            </w:r>
+          </w:p>
+        </w:tc>
+        <w:tc>
+          <w:tcPr>
+            <w:tcW w:type="dxa" w:w="2513"/>
+            <w:tcBorders>
+              <w:top w:val="single" w:color="BBBBBB" w:sz="4"/>
+              <w:left w:val="single" w:color="BBBBBB" w:sz="4"/>
+              <w:bottom w:val="single" w:color="BBBBBB" w:sz="4"/>
+              <w:right w:val="single" w:color="BBBBBB" w:sz="4"/>
+            </w:tcBorders>
+            <w:tcMar>
+              <w:top w:type="dxa" w:w="70"/>
+              <w:left w:type="dxa" w:w="110"/>
+              <w:bottom w:type="dxa" w:w="70"/>
+              <w:right w:type="dxa" w:w="110"/>
+            </w:tcMar>
+          </w:tcPr>
+          <w:p>
+            <w:r>
+              <w:rPr>
+                <w:rFonts w:ascii="Arial" w:cs="Arial" w:eastAsia="Arial" w:hAnsi="Arial"/>
+                <w:sz w:val="20"/>
+                <w:szCs w:val="20"/>
+              </w:rPr>
+              <w:t xml:space="preserve">830–1380 px</w:t>
+            </w:r>
+          </w:p>
+        </w:tc>
+        <w:tc>
+          <w:tcPr>
+            <w:tcW w:type="dxa" w:w="1549"/>
+            <w:tcBorders>
+              <w:top w:val="single" w:color="BBBBBB" w:sz="4"/>
+              <w:left w:val="single" w:color="BBBBBB" w:sz="4"/>
+              <w:bottom w:val="single" w:color="BBBBBB" w:sz="4"/>
+              <w:right w:val="single" w:color="BBBBBB" w:sz="4"/>
+            </w:tcBorders>
+            <w:tcMar>
+              <w:top w:type="dxa" w:w="70"/>
+              <w:left w:type="dxa" w:w="110"/>
+              <w:bottom w:type="dxa" w:w="70"/>
+              <w:right w:type="dxa" w:w="110"/>
+            </w:tcMar>
+          </w:tcPr>
+          <w:p>
+            <w:r>
+              <w:rPr>
+                <w:rFonts w:ascii="Arial" w:cs="Arial" w:eastAsia="Arial" w:hAnsi="Arial"/>
+                <w:sz w:val="20"/>
+                <w:szCs w:val="20"/>
+              </w:rPr>
+              <w:t xml:space="preserve">1080</w:t>
+            </w:r>
+          </w:p>
+        </w:tc>
+      </w:tr>
+    </w:tbl>
+    <w:p>
+      <w:pPr>
+        <w:spacing w:after="120"/>
+      </w:pPr>
+    </w:p>
+    <w:p>
+      <w:pPr>
+        <w:spacing w:after="140" w:line="300"/>
+      </w:pPr>
+      <w:r>
+        <w:rPr>
+          <w:rFonts w:ascii="Arial" w:cs="Arial" w:eastAsia="Arial" w:hAnsi="Arial"/>
+          <w:sz w:val="22"/>
+          <w:szCs w:val="22"/>
+        </w:rPr>
+        <w:t xml:space="preserve">Розмір визначається під час відкриття сторіс і при зміні розміру вікна; новий розмір застосовується з наступного слайда. Поточне відео не перезавантажується.</w:t>
+      </w:r>
+    </w:p>
+    <w:p>
+      <w:pPr>
+        <w:pStyle w:val="Heading2"/>
+      </w:pPr>
+      <w:r>
+        <w:rPr>
+          <w:rFonts w:ascii="Arial" w:cs="Arial" w:eastAsia="Arial" w:hAnsi="Arial"/>
+        </w:rPr>
         <w:t xml:space="preserve">Формати</w:t>
       </w:r>
     </w:p>
@@ -3780,7 +4328,7 @@
           <w:sz w:val="22"/>
           <w:szCs w:val="22"/>
         </w:rPr>
-        <w:t xml:space="preserve">Кожне відео підготовлено в чотирьох форматах. Браузер отримує всі чотири джерела та відтворює перше, яке підтримує.</w:t>
+        <w:t xml:space="preserve">Кожен розмір підготовлено в чотирьох форматах. Браузер отримує всі чотири джерела та відтворює перше, яке підтримує.</w:t>
       </w:r>
     </w:p>
     <w:tbl>
@@ -3797,9 +4345,9 @@
       </w:tblPr>
       <w:tblGrid>
         <w:gridCol w:w="1205"/>
-        <w:gridCol w:w="1321"/>
+        <w:gridCol w:w="2701"/>
         <w:gridCol w:w="2420"/>
-        <w:gridCol w:w="4080"/>
+        <w:gridCol w:w="2700"/>
       </w:tblGrid>
       <w:tr>
         <w:trPr>
@@ -3837,7 +4385,7 @@
         </w:tc>
         <w:tc>
           <w:tcPr>
-            <w:tcW w:type="dxa" w:w="1321"/>
+            <w:tcW w:type="dxa" w:w="2701"/>
             <w:tcBorders>
               <w:top w:val="single" w:color="BBBBBB" w:sz="4"/>
               <w:left w:val="single" w:color="BBBBBB" w:sz="4"/>
@@ -3891,13 +4439,13 @@
                 <w:sz w:val="20"/>
                 <w:szCs w:val="20"/>
               </w:rPr>
-              <w:t xml:space="preserve">Файл</w:t>
-            </w:r>
-          </w:p>
-        </w:tc>
-        <w:tc>
-          <w:tcPr>
-            <w:tcW w:type="dxa" w:w="4080"/>
+              <w:t xml:space="preserve">Файл 1080</w:t>
+            </w:r>
+          </w:p>
+        </w:tc>
+        <w:tc>
+          <w:tcPr>
+            <w:tcW w:type="dxa" w:w="2700"/>
             <w:tcBorders>
               <w:top w:val="single" w:color="BBBBBB" w:sz="4"/>
               <w:left w:val="single" w:color="BBBBBB" w:sz="4"/>
@@ -3921,7 +4469,7 @@
                 <w:sz w:val="20"/>
                 <w:szCs w:val="20"/>
               </w:rPr>
-              <w:t xml:space="preserve">Тип джерела</w:t>
+              <w:t xml:space="preserve">Файл 720</w:t>
             </w:r>
           </w:p>
         </w:tc>
@@ -3959,7 +4507,7 @@
         </w:tc>
         <w:tc>
           <w:tcPr>
-            <w:tcW w:type="dxa" w:w="1321"/>
+            <w:tcW w:type="dxa" w:w="2701"/>
             <w:tcBorders>
               <w:top w:val="single" w:color="BBBBBB" w:sz="4"/>
               <w:left w:val="single" w:color="BBBBBB" w:sz="4"/>
@@ -4014,7 +4562,7 @@
         </w:tc>
         <w:tc>
           <w:tcPr>
-            <w:tcW w:type="dxa" w:w="4080"/>
+            <w:tcW w:type="dxa" w:w="2700"/>
             <w:tcBorders>
               <w:top w:val="single" w:color="BBBBBB" w:sz="4"/>
               <w:left w:val="single" w:color="BBBBBB" w:sz="4"/>
@@ -4036,7 +4584,7 @@
                 <w:szCs w:val="20"/>
                 <w:shd w:fill="F0F0F0" w:val="clear"/>
               </w:rPr>
-              <w:t xml:space="preserve">video/mp4; codecs="av01.0.08M.08, mp4a.40.2"</w:t>
+              <w:t xml:space="preserve">story_N-720-av1.mp4</w:t>
             </w:r>
           </w:p>
         </w:tc>
@@ -4074,7 +4622,7 @@
         </w:tc>
         <w:tc>
           <w:tcPr>
-            <w:tcW w:type="dxa" w:w="1321"/>
+            <w:tcW w:type="dxa" w:w="2701"/>
             <w:tcBorders>
               <w:top w:val="single" w:color="BBBBBB" w:sz="4"/>
               <w:left w:val="single" w:color="BBBBBB" w:sz="4"/>
@@ -4129,7 +4677,7 @@
         </w:tc>
         <w:tc>
           <w:tcPr>
-            <w:tcW w:type="dxa" w:w="4080"/>
+            <w:tcW w:type="dxa" w:w="2700"/>
             <w:tcBorders>
               <w:top w:val="single" w:color="BBBBBB" w:sz="4"/>
               <w:left w:val="single" w:color="BBBBBB" w:sz="4"/>
@@ -4151,7 +4699,7 @@
                 <w:szCs w:val="20"/>
                 <w:shd w:fill="F0F0F0" w:val="clear"/>
               </w:rPr>
-              <w:t xml:space="preserve">video/mp4; codecs="hvc1.1.6.L120.90, mp4a.40.2"</w:t>
+              <w:t xml:space="preserve">story_N-720-h265.mp4</w:t>
             </w:r>
           </w:p>
         </w:tc>
@@ -4189,7 +4737,7 @@
         </w:tc>
         <w:tc>
           <w:tcPr>
-            <w:tcW w:type="dxa" w:w="1321"/>
+            <w:tcW w:type="dxa" w:w="2701"/>
             <w:tcBorders>
               <w:top w:val="single" w:color="BBBBBB" w:sz="4"/>
               <w:left w:val="single" w:color="BBBBBB" w:sz="4"/>
@@ -4244,7 +4792,7 @@
         </w:tc>
         <w:tc>
           <w:tcPr>
-            <w:tcW w:type="dxa" w:w="4080"/>
+            <w:tcW w:type="dxa" w:w="2700"/>
             <w:tcBorders>
               <w:top w:val="single" w:color="BBBBBB" w:sz="4"/>
               <w:left w:val="single" w:color="BBBBBB" w:sz="4"/>
@@ -4266,7 +4814,7 @@
                 <w:szCs w:val="20"/>
                 <w:shd w:fill="F0F0F0" w:val="clear"/>
               </w:rPr>
-              <w:t xml:space="preserve">video/mp4; codecs="avc1.640028, mp4a.40.2"</w:t>
+              <w:t xml:space="preserve">story_N-720-h264.mp4</w:t>
             </w:r>
           </w:p>
         </w:tc>
@@ -4304,7 +4852,7 @@
         </w:tc>
         <w:tc>
           <w:tcPr>
-            <w:tcW w:type="dxa" w:w="1321"/>
+            <w:tcW w:type="dxa" w:w="2701"/>
             <w:tcBorders>
               <w:top w:val="single" w:color="BBBBBB" w:sz="4"/>
               <w:left w:val="single" w:color="BBBBBB" w:sz="4"/>
@@ -4359,7 +4907,7 @@
         </w:tc>
         <w:tc>
           <w:tcPr>
-            <w:tcW w:type="dxa" w:w="4080"/>
+            <w:tcW w:type="dxa" w:w="2700"/>
             <w:tcBorders>
               <w:top w:val="single" w:color="BBBBBB" w:sz="4"/>
               <w:left w:val="single" w:color="BBBBBB" w:sz="4"/>
@@ -4381,7 +4929,7 @@
                 <w:szCs w:val="20"/>
                 <w:shd w:fill="F0F0F0" w:val="clear"/>
               </w:rPr>
-              <w:t xml:space="preserve">video/webm; codecs="vp09.00.40.08, opus"</w:t>
+              <w:t xml:space="preserve">story_N-720.webm</w:t>
             </w:r>
           </w:p>
         </w:tc>
@@ -4402,6 +4950,489 @@
           <w:sz w:val="22"/>
           <w:szCs w:val="22"/>
         </w:rPr>
+        <w:t xml:space="preserve">Типи джерел:</w:t>
+      </w:r>
+    </w:p>
+    <w:tbl>
+      <w:tblPr>
+        <w:tblW w:type="dxa" w:w="9026"/>
+        <w:tblBorders>
+          <w:top w:val="single" w:color="auto" w:sz="4"/>
+          <w:left w:val="single" w:color="auto" w:sz="4"/>
+          <w:bottom w:val="single" w:color="auto" w:sz="4"/>
+          <w:right w:val="single" w:color="auto" w:sz="4"/>
+          <w:insideH w:val="single" w:color="auto" w:sz="4"/>
+          <w:insideV w:val="single" w:color="auto" w:sz="4"/>
+        </w:tblBorders>
+      </w:tblPr>
+      <w:tblGrid>
+        <w:gridCol w:w="1283"/>
+        <w:gridCol w:w="3872"/>
+        <w:gridCol w:w="3871"/>
+      </w:tblGrid>
+      <w:tr>
+        <w:trPr>
+          <w:tblHeader/>
+        </w:trPr>
+        <w:tc>
+          <w:tcPr>
+            <w:tcW w:type="dxa" w:w="1283"/>
+            <w:tcBorders>
+              <w:top w:val="single" w:color="BBBBBB" w:sz="4"/>
+              <w:left w:val="single" w:color="BBBBBB" w:sz="4"/>
+              <w:bottom w:val="single" w:color="BBBBBB" w:sz="4"/>
+              <w:right w:val="single" w:color="BBBBBB" w:sz="4"/>
+            </w:tcBorders>
+            <w:shd w:fill="E8EEF4" w:val="clear"/>
+            <w:tcMar>
+              <w:top w:type="dxa" w:w="70"/>
+              <w:left w:type="dxa" w:w="110"/>
+              <w:bottom w:type="dxa" w:w="70"/>
+              <w:right w:type="dxa" w:w="110"/>
+            </w:tcMar>
+          </w:tcPr>
+          <w:p>
+            <w:r>
+              <w:rPr>
+                <w:rFonts w:ascii="Arial" w:cs="Arial" w:eastAsia="Arial" w:hAnsi="Arial"/>
+                <w:b/>
+                <w:bCs/>
+                <w:sz w:val="20"/>
+                <w:szCs w:val="20"/>
+              </w:rPr>
+              <w:t xml:space="preserve">Формат</w:t>
+            </w:r>
+          </w:p>
+        </w:tc>
+        <w:tc>
+          <w:tcPr>
+            <w:tcW w:type="dxa" w:w="3872"/>
+            <w:tcBorders>
+              <w:top w:val="single" w:color="BBBBBB" w:sz="4"/>
+              <w:left w:val="single" w:color="BBBBBB" w:sz="4"/>
+              <w:bottom w:val="single" w:color="BBBBBB" w:sz="4"/>
+              <w:right w:val="single" w:color="BBBBBB" w:sz="4"/>
+            </w:tcBorders>
+            <w:shd w:fill="E8EEF4" w:val="clear"/>
+            <w:tcMar>
+              <w:top w:type="dxa" w:w="70"/>
+              <w:left w:type="dxa" w:w="110"/>
+              <w:bottom w:type="dxa" w:w="70"/>
+              <w:right w:type="dxa" w:w="110"/>
+            </w:tcMar>
+          </w:tcPr>
+          <w:p>
+            <w:r>
+              <w:rPr>
+                <w:rFonts w:ascii="Arial" w:cs="Arial" w:eastAsia="Arial" w:hAnsi="Arial"/>
+                <w:b/>
+                <w:bCs/>
+                <w:sz w:val="20"/>
+                <w:szCs w:val="20"/>
+              </w:rPr>
+              <w:t xml:space="preserve">Тип джерела 1080</w:t>
+            </w:r>
+          </w:p>
+        </w:tc>
+        <w:tc>
+          <w:tcPr>
+            <w:tcW w:type="dxa" w:w="3871"/>
+            <w:tcBorders>
+              <w:top w:val="single" w:color="BBBBBB" w:sz="4"/>
+              <w:left w:val="single" w:color="BBBBBB" w:sz="4"/>
+              <w:bottom w:val="single" w:color="BBBBBB" w:sz="4"/>
+              <w:right w:val="single" w:color="BBBBBB" w:sz="4"/>
+            </w:tcBorders>
+            <w:shd w:fill="E8EEF4" w:val="clear"/>
+            <w:tcMar>
+              <w:top w:type="dxa" w:w="70"/>
+              <w:left w:type="dxa" w:w="110"/>
+              <w:bottom w:type="dxa" w:w="70"/>
+              <w:right w:type="dxa" w:w="110"/>
+            </w:tcMar>
+          </w:tcPr>
+          <w:p>
+            <w:r>
+              <w:rPr>
+                <w:rFonts w:ascii="Arial" w:cs="Arial" w:eastAsia="Arial" w:hAnsi="Arial"/>
+                <w:b/>
+                <w:bCs/>
+                <w:sz w:val="20"/>
+                <w:szCs w:val="20"/>
+              </w:rPr>
+              <w:t xml:space="preserve">Тип джерела 720</w:t>
+            </w:r>
+          </w:p>
+        </w:tc>
+      </w:tr>
+      <w:tr>
+        <w:trPr>
+          <w:tblHeader w:val="off"/>
+        </w:trPr>
+        <w:tc>
+          <w:tcPr>
+            <w:tcW w:type="dxa" w:w="1283"/>
+            <w:tcBorders>
+              <w:top w:val="single" w:color="BBBBBB" w:sz="4"/>
+              <w:left w:val="single" w:color="BBBBBB" w:sz="4"/>
+              <w:bottom w:val="single" w:color="BBBBBB" w:sz="4"/>
+              <w:right w:val="single" w:color="BBBBBB" w:sz="4"/>
+            </w:tcBorders>
+            <w:tcMar>
+              <w:top w:type="dxa" w:w="70"/>
+              <w:left w:type="dxa" w:w="110"/>
+              <w:bottom w:type="dxa" w:w="70"/>
+              <w:right w:type="dxa" w:w="110"/>
+            </w:tcMar>
+          </w:tcPr>
+          <w:p>
+            <w:r>
+              <w:rPr>
+                <w:rFonts w:ascii="Arial" w:cs="Arial" w:eastAsia="Arial" w:hAnsi="Arial"/>
+                <w:sz w:val="20"/>
+                <w:szCs w:val="20"/>
+              </w:rPr>
+              <w:t xml:space="preserve">AV1</w:t>
+            </w:r>
+          </w:p>
+        </w:tc>
+        <w:tc>
+          <w:tcPr>
+            <w:tcW w:type="dxa" w:w="3872"/>
+            <w:tcBorders>
+              <w:top w:val="single" w:color="BBBBBB" w:sz="4"/>
+              <w:left w:val="single" w:color="BBBBBB" w:sz="4"/>
+              <w:bottom w:val="single" w:color="BBBBBB" w:sz="4"/>
+              <w:right w:val="single" w:color="BBBBBB" w:sz="4"/>
+            </w:tcBorders>
+            <w:tcMar>
+              <w:top w:type="dxa" w:w="70"/>
+              <w:left w:type="dxa" w:w="110"/>
+              <w:bottom w:type="dxa" w:w="70"/>
+              <w:right w:type="dxa" w:w="110"/>
+            </w:tcMar>
+          </w:tcPr>
+          <w:p>
+            <w:r>
+              <w:rPr>
+                <w:rFonts w:ascii="Menlo" w:cs="Menlo" w:eastAsia="Menlo" w:hAnsi="Menlo"/>
+                <w:sz w:val="20"/>
+                <w:szCs w:val="20"/>
+                <w:shd w:fill="F0F0F0" w:val="clear"/>
+              </w:rPr>
+              <w:t xml:space="preserve">video/mp4; codecs="av01.0.08M.08, mp4a.40.2"</w:t>
+            </w:r>
+          </w:p>
+        </w:tc>
+        <w:tc>
+          <w:tcPr>
+            <w:tcW w:type="dxa" w:w="3871"/>
+            <w:tcBorders>
+              <w:top w:val="single" w:color="BBBBBB" w:sz="4"/>
+              <w:left w:val="single" w:color="BBBBBB" w:sz="4"/>
+              <w:bottom w:val="single" w:color="BBBBBB" w:sz="4"/>
+              <w:right w:val="single" w:color="BBBBBB" w:sz="4"/>
+            </w:tcBorders>
+            <w:tcMar>
+              <w:top w:type="dxa" w:w="70"/>
+              <w:left w:type="dxa" w:w="110"/>
+              <w:bottom w:type="dxa" w:w="70"/>
+              <w:right w:type="dxa" w:w="110"/>
+            </w:tcMar>
+          </w:tcPr>
+          <w:p>
+            <w:r>
+              <w:rPr>
+                <w:rFonts w:ascii="Menlo" w:cs="Menlo" w:eastAsia="Menlo" w:hAnsi="Menlo"/>
+                <w:sz w:val="20"/>
+                <w:szCs w:val="20"/>
+                <w:shd w:fill="F0F0F0" w:val="clear"/>
+              </w:rPr>
+              <w:t xml:space="preserve">video/mp4; codecs="av01.0.05M.08, mp4a.40.2"</w:t>
+            </w:r>
+          </w:p>
+        </w:tc>
+      </w:tr>
+      <w:tr>
+        <w:trPr>
+          <w:tblHeader w:val="off"/>
+        </w:trPr>
+        <w:tc>
+          <w:tcPr>
+            <w:tcW w:type="dxa" w:w="1283"/>
+            <w:tcBorders>
+              <w:top w:val="single" w:color="BBBBBB" w:sz="4"/>
+              <w:left w:val="single" w:color="BBBBBB" w:sz="4"/>
+              <w:bottom w:val="single" w:color="BBBBBB" w:sz="4"/>
+              <w:right w:val="single" w:color="BBBBBB" w:sz="4"/>
+            </w:tcBorders>
+            <w:tcMar>
+              <w:top w:type="dxa" w:w="70"/>
+              <w:left w:type="dxa" w:w="110"/>
+              <w:bottom w:type="dxa" w:w="70"/>
+              <w:right w:type="dxa" w:w="110"/>
+            </w:tcMar>
+          </w:tcPr>
+          <w:p>
+            <w:r>
+              <w:rPr>
+                <w:rFonts w:ascii="Arial" w:cs="Arial" w:eastAsia="Arial" w:hAnsi="Arial"/>
+                <w:sz w:val="20"/>
+                <w:szCs w:val="20"/>
+              </w:rPr>
+              <w:t xml:space="preserve">H.265</w:t>
+            </w:r>
+          </w:p>
+        </w:tc>
+        <w:tc>
+          <w:tcPr>
+            <w:tcW w:type="dxa" w:w="3872"/>
+            <w:tcBorders>
+              <w:top w:val="single" w:color="BBBBBB" w:sz="4"/>
+              <w:left w:val="single" w:color="BBBBBB" w:sz="4"/>
+              <w:bottom w:val="single" w:color="BBBBBB" w:sz="4"/>
+              <w:right w:val="single" w:color="BBBBBB" w:sz="4"/>
+            </w:tcBorders>
+            <w:tcMar>
+              <w:top w:type="dxa" w:w="70"/>
+              <w:left w:type="dxa" w:w="110"/>
+              <w:bottom w:type="dxa" w:w="70"/>
+              <w:right w:type="dxa" w:w="110"/>
+            </w:tcMar>
+          </w:tcPr>
+          <w:p>
+            <w:r>
+              <w:rPr>
+                <w:rFonts w:ascii="Menlo" w:cs="Menlo" w:eastAsia="Menlo" w:hAnsi="Menlo"/>
+                <w:sz w:val="20"/>
+                <w:szCs w:val="20"/>
+                <w:shd w:fill="F0F0F0" w:val="clear"/>
+              </w:rPr>
+              <w:t xml:space="preserve">video/mp4; codecs="hvc1.1.6.L120.90, mp4a.40.2"</w:t>
+            </w:r>
+          </w:p>
+        </w:tc>
+        <w:tc>
+          <w:tcPr>
+            <w:tcW w:type="dxa" w:w="3871"/>
+            <w:tcBorders>
+              <w:top w:val="single" w:color="BBBBBB" w:sz="4"/>
+              <w:left w:val="single" w:color="BBBBBB" w:sz="4"/>
+              <w:bottom w:val="single" w:color="BBBBBB" w:sz="4"/>
+              <w:right w:val="single" w:color="BBBBBB" w:sz="4"/>
+            </w:tcBorders>
+            <w:tcMar>
+              <w:top w:type="dxa" w:w="70"/>
+              <w:left w:type="dxa" w:w="110"/>
+              <w:bottom w:type="dxa" w:w="70"/>
+              <w:right w:type="dxa" w:w="110"/>
+            </w:tcMar>
+          </w:tcPr>
+          <w:p>
+            <w:r>
+              <w:rPr>
+                <w:rFonts w:ascii="Menlo" w:cs="Menlo" w:eastAsia="Menlo" w:hAnsi="Menlo"/>
+                <w:sz w:val="20"/>
+                <w:szCs w:val="20"/>
+                <w:shd w:fill="F0F0F0" w:val="clear"/>
+              </w:rPr>
+              <w:t xml:space="preserve">video/mp4; codecs="hvc1.1.6.L93.90, mp4a.40.2"</w:t>
+            </w:r>
+          </w:p>
+        </w:tc>
+      </w:tr>
+      <w:tr>
+        <w:trPr>
+          <w:tblHeader w:val="off"/>
+        </w:trPr>
+        <w:tc>
+          <w:tcPr>
+            <w:tcW w:type="dxa" w:w="1283"/>
+            <w:tcBorders>
+              <w:top w:val="single" w:color="BBBBBB" w:sz="4"/>
+              <w:left w:val="single" w:color="BBBBBB" w:sz="4"/>
+              <w:bottom w:val="single" w:color="BBBBBB" w:sz="4"/>
+              <w:right w:val="single" w:color="BBBBBB" w:sz="4"/>
+            </w:tcBorders>
+            <w:tcMar>
+              <w:top w:type="dxa" w:w="70"/>
+              <w:left w:type="dxa" w:w="110"/>
+              <w:bottom w:type="dxa" w:w="70"/>
+              <w:right w:type="dxa" w:w="110"/>
+            </w:tcMar>
+          </w:tcPr>
+          <w:p>
+            <w:r>
+              <w:rPr>
+                <w:rFonts w:ascii="Arial" w:cs="Arial" w:eastAsia="Arial" w:hAnsi="Arial"/>
+                <w:sz w:val="20"/>
+                <w:szCs w:val="20"/>
+              </w:rPr>
+              <w:t xml:space="preserve">H.264</w:t>
+            </w:r>
+          </w:p>
+        </w:tc>
+        <w:tc>
+          <w:tcPr>
+            <w:tcW w:type="dxa" w:w="3872"/>
+            <w:tcBorders>
+              <w:top w:val="single" w:color="BBBBBB" w:sz="4"/>
+              <w:left w:val="single" w:color="BBBBBB" w:sz="4"/>
+              <w:bottom w:val="single" w:color="BBBBBB" w:sz="4"/>
+              <w:right w:val="single" w:color="BBBBBB" w:sz="4"/>
+            </w:tcBorders>
+            <w:tcMar>
+              <w:top w:type="dxa" w:w="70"/>
+              <w:left w:type="dxa" w:w="110"/>
+              <w:bottom w:type="dxa" w:w="70"/>
+              <w:right w:type="dxa" w:w="110"/>
+            </w:tcMar>
+          </w:tcPr>
+          <w:p>
+            <w:r>
+              <w:rPr>
+                <w:rFonts w:ascii="Menlo" w:cs="Menlo" w:eastAsia="Menlo" w:hAnsi="Menlo"/>
+                <w:sz w:val="20"/>
+                <w:szCs w:val="20"/>
+                <w:shd w:fill="F0F0F0" w:val="clear"/>
+              </w:rPr>
+              <w:t xml:space="preserve">video/mp4; codecs="avc1.640028, mp4a.40.2"</w:t>
+            </w:r>
+          </w:p>
+        </w:tc>
+        <w:tc>
+          <w:tcPr>
+            <w:tcW w:type="dxa" w:w="3871"/>
+            <w:tcBorders>
+              <w:top w:val="single" w:color="BBBBBB" w:sz="4"/>
+              <w:left w:val="single" w:color="BBBBBB" w:sz="4"/>
+              <w:bottom w:val="single" w:color="BBBBBB" w:sz="4"/>
+              <w:right w:val="single" w:color="BBBBBB" w:sz="4"/>
+            </w:tcBorders>
+            <w:tcMar>
+              <w:top w:type="dxa" w:w="70"/>
+              <w:left w:type="dxa" w:w="110"/>
+              <w:bottom w:type="dxa" w:w="70"/>
+              <w:right w:type="dxa" w:w="110"/>
+            </w:tcMar>
+          </w:tcPr>
+          <w:p>
+            <w:r>
+              <w:rPr>
+                <w:rFonts w:ascii="Menlo" w:cs="Menlo" w:eastAsia="Menlo" w:hAnsi="Menlo"/>
+                <w:sz w:val="20"/>
+                <w:szCs w:val="20"/>
+                <w:shd w:fill="F0F0F0" w:val="clear"/>
+              </w:rPr>
+              <w:t xml:space="preserve">video/mp4; codecs="avc1.64001F, mp4a.40.2"</w:t>
+            </w:r>
+          </w:p>
+        </w:tc>
+      </w:tr>
+      <w:tr>
+        <w:trPr>
+          <w:tblHeader w:val="off"/>
+        </w:trPr>
+        <w:tc>
+          <w:tcPr>
+            <w:tcW w:type="dxa" w:w="1283"/>
+            <w:tcBorders>
+              <w:top w:val="single" w:color="BBBBBB" w:sz="4"/>
+              <w:left w:val="single" w:color="BBBBBB" w:sz="4"/>
+              <w:bottom w:val="single" w:color="BBBBBB" w:sz="4"/>
+              <w:right w:val="single" w:color="BBBBBB" w:sz="4"/>
+            </w:tcBorders>
+            <w:tcMar>
+              <w:top w:type="dxa" w:w="70"/>
+              <w:left w:type="dxa" w:w="110"/>
+              <w:bottom w:type="dxa" w:w="70"/>
+              <w:right w:type="dxa" w:w="110"/>
+            </w:tcMar>
+          </w:tcPr>
+          <w:p>
+            <w:r>
+              <w:rPr>
+                <w:rFonts w:ascii="Arial" w:cs="Arial" w:eastAsia="Arial" w:hAnsi="Arial"/>
+                <w:sz w:val="20"/>
+                <w:szCs w:val="20"/>
+              </w:rPr>
+              <w:t xml:space="preserve">WebM (VP9)</w:t>
+            </w:r>
+          </w:p>
+        </w:tc>
+        <w:tc>
+          <w:tcPr>
+            <w:tcW w:type="dxa" w:w="3872"/>
+            <w:tcBorders>
+              <w:top w:val="single" w:color="BBBBBB" w:sz="4"/>
+              <w:left w:val="single" w:color="BBBBBB" w:sz="4"/>
+              <w:bottom w:val="single" w:color="BBBBBB" w:sz="4"/>
+              <w:right w:val="single" w:color="BBBBBB" w:sz="4"/>
+            </w:tcBorders>
+            <w:tcMar>
+              <w:top w:type="dxa" w:w="70"/>
+              <w:left w:type="dxa" w:w="110"/>
+              <w:bottom w:type="dxa" w:w="70"/>
+              <w:right w:type="dxa" w:w="110"/>
+            </w:tcMar>
+          </w:tcPr>
+          <w:p>
+            <w:r>
+              <w:rPr>
+                <w:rFonts w:ascii="Menlo" w:cs="Menlo" w:eastAsia="Menlo" w:hAnsi="Menlo"/>
+                <w:sz w:val="20"/>
+                <w:szCs w:val="20"/>
+                <w:shd w:fill="F0F0F0" w:val="clear"/>
+              </w:rPr>
+              <w:t xml:space="preserve">video/webm; codecs="vp09.00.40.08, opus"</w:t>
+            </w:r>
+          </w:p>
+        </w:tc>
+        <w:tc>
+          <w:tcPr>
+            <w:tcW w:type="dxa" w:w="3871"/>
+            <w:tcBorders>
+              <w:top w:val="single" w:color="BBBBBB" w:sz="4"/>
+              <w:left w:val="single" w:color="BBBBBB" w:sz="4"/>
+              <w:bottom w:val="single" w:color="BBBBBB" w:sz="4"/>
+              <w:right w:val="single" w:color="BBBBBB" w:sz="4"/>
+            </w:tcBorders>
+            <w:tcMar>
+              <w:top w:type="dxa" w:w="70"/>
+              <w:left w:type="dxa" w:w="110"/>
+              <w:bottom w:type="dxa" w:w="70"/>
+              <w:right w:type="dxa" w:w="110"/>
+            </w:tcMar>
+          </w:tcPr>
+          <w:p>
+            <w:r>
+              <w:rPr>
+                <w:rFonts w:ascii="Menlo" w:cs="Menlo" w:eastAsia="Menlo" w:hAnsi="Menlo"/>
+                <w:sz w:val="20"/>
+                <w:szCs w:val="20"/>
+                <w:shd w:fill="F0F0F0" w:val="clear"/>
+              </w:rPr>
+              <w:t xml:space="preserve">video/webm; codecs="vp09.00.31.08, opus"</w:t>
+            </w:r>
+          </w:p>
+        </w:tc>
+      </w:tr>
+    </w:tbl>
+    <w:p>
+      <w:pPr>
+        <w:spacing w:after="120"/>
+      </w:pPr>
+    </w:p>
+    <w:p>
+      <w:pPr>
+        <w:spacing w:after="140" w:line="300"/>
+      </w:pPr>
+      <w:r>
+        <w:rPr>
+          <w:rFonts w:ascii="Arial" w:cs="Arial" w:eastAsia="Arial" w:hAnsi="Arial"/>
+          <w:sz w:val="22"/>
+          <w:szCs w:val="22"/>
+        </w:rPr>
         <w:t xml:space="preserve">AV1 пропонується лише пристроям з апаратним декодуванням цього формату; решта пристроїв починає з H.265.</w:t>
       </w:r>
     </w:p>
@@ -4415,7 +5446,7 @@
           <w:sz w:val="22"/>
           <w:szCs w:val="22"/>
         </w:rPr>
-        <w:t xml:space="preserve">Параметри всіх файлів: 1080×1920, 30 кадрів за секунду, зі звуковою доріжкою.</w:t>
+        <w:t xml:space="preserve">Параметри всіх файлів: 30 кадрів за секунду, зі звуковою доріжкою.</w:t>
       </w:r>
     </w:p>
     <w:p>
@@ -4427,6 +5458,19 @@
           <w:rFonts w:ascii="Arial" w:cs="Arial" w:eastAsia="Arial" w:hAnsi="Arial"/>
         </w:rPr>
         <w:t xml:space="preserve">Розмір файлів, МБ</w:t>
+      </w:r>
+    </w:p>
+    <w:p>
+      <w:pPr>
+        <w:spacing w:after="140" w:line="300"/>
+      </w:pPr>
+      <w:r>
+        <w:rPr>
+          <w:rFonts w:ascii="Arial" w:cs="Arial" w:eastAsia="Arial" w:hAnsi="Arial"/>
+          <w:sz w:val="22"/>
+          <w:szCs w:val="22"/>
+        </w:rPr>
+        <w:t xml:space="preserve">У кожній клітинці — розмір файлу 1080 / розмір файлу 720.</w:t>
       </w:r>
     </w:p>
     <w:tbl>
@@ -4443,10 +5487,10 @@
       </w:tblPr>
       <w:tblGrid>
         <w:gridCol w:w="935"/>
-        <w:gridCol w:w="800"/>
-        <w:gridCol w:w="935"/>
-        <w:gridCol w:w="935"/>
-        <w:gridCol w:w="5421"/>
+        <w:gridCol w:w="1922"/>
+        <w:gridCol w:w="2057"/>
+        <w:gridCol w:w="2057"/>
+        <w:gridCol w:w="2055"/>
       </w:tblGrid>
       <w:tr>
         <w:trPr>
@@ -4484,7 +5528,7 @@
         </w:tc>
         <w:tc>
           <w:tcPr>
-            <w:tcW w:type="dxa" w:w="800"/>
+            <w:tcW w:type="dxa" w:w="1922"/>
             <w:tcBorders>
               <w:top w:val="single" w:color="BBBBBB" w:sz="4"/>
               <w:left w:val="single" w:color="BBBBBB" w:sz="4"/>
@@ -4514,7 +5558,7 @@
         </w:tc>
         <w:tc>
           <w:tcPr>
-            <w:tcW w:type="dxa" w:w="935"/>
+            <w:tcW w:type="dxa" w:w="2057"/>
             <w:tcBorders>
               <w:top w:val="single" w:color="BBBBBB" w:sz="4"/>
               <w:left w:val="single" w:color="BBBBBB" w:sz="4"/>
@@ -4544,7 +5588,7 @@
         </w:tc>
         <w:tc>
           <w:tcPr>
-            <w:tcW w:type="dxa" w:w="935"/>
+            <w:tcW w:type="dxa" w:w="2057"/>
             <w:tcBorders>
               <w:top w:val="single" w:color="BBBBBB" w:sz="4"/>
               <w:left w:val="single" w:color="BBBBBB" w:sz="4"/>
@@ -4574,7 +5618,7 @@
         </w:tc>
         <w:tc>
           <w:tcPr>
-            <w:tcW w:type="dxa" w:w="5421"/>
+            <w:tcW w:type="dxa" w:w="2055"/>
             <w:tcBorders>
               <w:top w:val="single" w:color="BBBBBB" w:sz="4"/>
               <w:left w:val="single" w:color="BBBBBB" w:sz="4"/>
@@ -4636,109 +5680,109 @@
         </w:tc>
         <w:tc>
           <w:tcPr>
-            <w:tcW w:type="dxa" w:w="800"/>
-            <w:tcBorders>
-              <w:top w:val="single" w:color="BBBBBB" w:sz="4"/>
-              <w:left w:val="single" w:color="BBBBBB" w:sz="4"/>
-              <w:bottom w:val="single" w:color="BBBBBB" w:sz="4"/>
-              <w:right w:val="single" w:color="BBBBBB" w:sz="4"/>
-            </w:tcBorders>
-            <w:tcMar>
-              <w:top w:type="dxa" w:w="70"/>
-              <w:left w:type="dxa" w:w="110"/>
-              <w:bottom w:type="dxa" w:w="70"/>
-              <w:right w:type="dxa" w:w="110"/>
-            </w:tcMar>
-          </w:tcPr>
-          <w:p>
-            <w:r>
-              <w:rPr>
-                <w:rFonts w:ascii="Arial" w:cs="Arial" w:eastAsia="Arial" w:hAnsi="Arial"/>
-                <w:sz w:val="20"/>
-                <w:szCs w:val="20"/>
-              </w:rPr>
-              <w:t xml:space="preserve">2,88</w:t>
-            </w:r>
-          </w:p>
-        </w:tc>
-        <w:tc>
-          <w:tcPr>
-            <w:tcW w:type="dxa" w:w="935"/>
-            <w:tcBorders>
-              <w:top w:val="single" w:color="BBBBBB" w:sz="4"/>
-              <w:left w:val="single" w:color="BBBBBB" w:sz="4"/>
-              <w:bottom w:val="single" w:color="BBBBBB" w:sz="4"/>
-              <w:right w:val="single" w:color="BBBBBB" w:sz="4"/>
-            </w:tcBorders>
-            <w:tcMar>
-              <w:top w:type="dxa" w:w="70"/>
-              <w:left w:type="dxa" w:w="110"/>
-              <w:bottom w:type="dxa" w:w="70"/>
-              <w:right w:type="dxa" w:w="110"/>
-            </w:tcMar>
-          </w:tcPr>
-          <w:p>
-            <w:r>
-              <w:rPr>
-                <w:rFonts w:ascii="Arial" w:cs="Arial" w:eastAsia="Arial" w:hAnsi="Arial"/>
-                <w:sz w:val="20"/>
-                <w:szCs w:val="20"/>
-              </w:rPr>
-              <w:t xml:space="preserve">2,76</w:t>
-            </w:r>
-          </w:p>
-        </w:tc>
-        <w:tc>
-          <w:tcPr>
-            <w:tcW w:type="dxa" w:w="935"/>
-            <w:tcBorders>
-              <w:top w:val="single" w:color="BBBBBB" w:sz="4"/>
-              <w:left w:val="single" w:color="BBBBBB" w:sz="4"/>
-              <w:bottom w:val="single" w:color="BBBBBB" w:sz="4"/>
-              <w:right w:val="single" w:color="BBBBBB" w:sz="4"/>
-            </w:tcBorders>
-            <w:tcMar>
-              <w:top w:type="dxa" w:w="70"/>
-              <w:left w:type="dxa" w:w="110"/>
-              <w:bottom w:type="dxa" w:w="70"/>
-              <w:right w:type="dxa" w:w="110"/>
-            </w:tcMar>
-          </w:tcPr>
-          <w:p>
-            <w:r>
-              <w:rPr>
-                <w:rFonts w:ascii="Arial" w:cs="Arial" w:eastAsia="Arial" w:hAnsi="Arial"/>
-                <w:sz w:val="20"/>
-                <w:szCs w:val="20"/>
-              </w:rPr>
-              <w:t xml:space="preserve">4,79</w:t>
-            </w:r>
-          </w:p>
-        </w:tc>
-        <w:tc>
-          <w:tcPr>
-            <w:tcW w:type="dxa" w:w="5421"/>
-            <w:tcBorders>
-              <w:top w:val="single" w:color="BBBBBB" w:sz="4"/>
-              <w:left w:val="single" w:color="BBBBBB" w:sz="4"/>
-              <w:bottom w:val="single" w:color="BBBBBB" w:sz="4"/>
-              <w:right w:val="single" w:color="BBBBBB" w:sz="4"/>
-            </w:tcBorders>
-            <w:tcMar>
-              <w:top w:type="dxa" w:w="70"/>
-              <w:left w:type="dxa" w:w="110"/>
-              <w:bottom w:type="dxa" w:w="70"/>
-              <w:right w:type="dxa" w:w="110"/>
-            </w:tcMar>
-          </w:tcPr>
-          <w:p>
-            <w:r>
-              <w:rPr>
-                <w:rFonts w:ascii="Arial" w:cs="Arial" w:eastAsia="Arial" w:hAnsi="Arial"/>
-                <w:sz w:val="20"/>
-                <w:szCs w:val="20"/>
-              </w:rPr>
-              <w:t xml:space="preserve">4,83</w:t>
+            <w:tcW w:type="dxa" w:w="1922"/>
+            <w:tcBorders>
+              <w:top w:val="single" w:color="BBBBBB" w:sz="4"/>
+              <w:left w:val="single" w:color="BBBBBB" w:sz="4"/>
+              <w:bottom w:val="single" w:color="BBBBBB" w:sz="4"/>
+              <w:right w:val="single" w:color="BBBBBB" w:sz="4"/>
+            </w:tcBorders>
+            <w:tcMar>
+              <w:top w:type="dxa" w:w="70"/>
+              <w:left w:type="dxa" w:w="110"/>
+              <w:bottom w:type="dxa" w:w="70"/>
+              <w:right w:type="dxa" w:w="110"/>
+            </w:tcMar>
+          </w:tcPr>
+          <w:p>
+            <w:r>
+              <w:rPr>
+                <w:rFonts w:ascii="Arial" w:cs="Arial" w:eastAsia="Arial" w:hAnsi="Arial"/>
+                <w:sz w:val="20"/>
+                <w:szCs w:val="20"/>
+              </w:rPr>
+              <w:t xml:space="preserve">2,88 / 2,04</w:t>
+            </w:r>
+          </w:p>
+        </w:tc>
+        <w:tc>
+          <w:tcPr>
+            <w:tcW w:type="dxa" w:w="2057"/>
+            <w:tcBorders>
+              <w:top w:val="single" w:color="BBBBBB" w:sz="4"/>
+              <w:left w:val="single" w:color="BBBBBB" w:sz="4"/>
+              <w:bottom w:val="single" w:color="BBBBBB" w:sz="4"/>
+              <w:right w:val="single" w:color="BBBBBB" w:sz="4"/>
+            </w:tcBorders>
+            <w:tcMar>
+              <w:top w:type="dxa" w:w="70"/>
+              <w:left w:type="dxa" w:w="110"/>
+              <w:bottom w:type="dxa" w:w="70"/>
+              <w:right w:type="dxa" w:w="110"/>
+            </w:tcMar>
+          </w:tcPr>
+          <w:p>
+            <w:r>
+              <w:rPr>
+                <w:rFonts w:ascii="Arial" w:cs="Arial" w:eastAsia="Arial" w:hAnsi="Arial"/>
+                <w:sz w:val="20"/>
+                <w:szCs w:val="20"/>
+              </w:rPr>
+              <w:t xml:space="preserve">2,76 / 1,85</w:t>
+            </w:r>
+          </w:p>
+        </w:tc>
+        <w:tc>
+          <w:tcPr>
+            <w:tcW w:type="dxa" w:w="2057"/>
+            <w:tcBorders>
+              <w:top w:val="single" w:color="BBBBBB" w:sz="4"/>
+              <w:left w:val="single" w:color="BBBBBB" w:sz="4"/>
+              <w:bottom w:val="single" w:color="BBBBBB" w:sz="4"/>
+              <w:right w:val="single" w:color="BBBBBB" w:sz="4"/>
+            </w:tcBorders>
+            <w:tcMar>
+              <w:top w:type="dxa" w:w="70"/>
+              <w:left w:type="dxa" w:w="110"/>
+              <w:bottom w:type="dxa" w:w="70"/>
+              <w:right w:type="dxa" w:w="110"/>
+            </w:tcMar>
+          </w:tcPr>
+          <w:p>
+            <w:r>
+              <w:rPr>
+                <w:rFonts w:ascii="Arial" w:cs="Arial" w:eastAsia="Arial" w:hAnsi="Arial"/>
+                <w:sz w:val="20"/>
+                <w:szCs w:val="20"/>
+              </w:rPr>
+              <w:t xml:space="preserve">4,79 / 2,92</w:t>
+            </w:r>
+          </w:p>
+        </w:tc>
+        <w:tc>
+          <w:tcPr>
+            <w:tcW w:type="dxa" w:w="2055"/>
+            <w:tcBorders>
+              <w:top w:val="single" w:color="BBBBBB" w:sz="4"/>
+              <w:left w:val="single" w:color="BBBBBB" w:sz="4"/>
+              <w:bottom w:val="single" w:color="BBBBBB" w:sz="4"/>
+              <w:right w:val="single" w:color="BBBBBB" w:sz="4"/>
+            </w:tcBorders>
+            <w:tcMar>
+              <w:top w:type="dxa" w:w="70"/>
+              <w:left w:type="dxa" w:w="110"/>
+              <w:bottom w:type="dxa" w:w="70"/>
+              <w:right w:type="dxa" w:w="110"/>
+            </w:tcMar>
+          </w:tcPr>
+          <w:p>
+            <w:r>
+              <w:rPr>
+                <w:rFonts w:ascii="Arial" w:cs="Arial" w:eastAsia="Arial" w:hAnsi="Arial"/>
+                <w:sz w:val="20"/>
+                <w:szCs w:val="20"/>
+              </w:rPr>
+              <w:t xml:space="preserve">4,83 / 3,15</w:t>
             </w:r>
           </w:p>
         </w:tc>
@@ -4776,109 +5820,109 @@
         </w:tc>
         <w:tc>
           <w:tcPr>
-            <w:tcW w:type="dxa" w:w="800"/>
-            <w:tcBorders>
-              <w:top w:val="single" w:color="BBBBBB" w:sz="4"/>
-              <w:left w:val="single" w:color="BBBBBB" w:sz="4"/>
-              <w:bottom w:val="single" w:color="BBBBBB" w:sz="4"/>
-              <w:right w:val="single" w:color="BBBBBB" w:sz="4"/>
-            </w:tcBorders>
-            <w:tcMar>
-              <w:top w:type="dxa" w:w="70"/>
-              <w:left w:type="dxa" w:w="110"/>
-              <w:bottom w:type="dxa" w:w="70"/>
-              <w:right w:type="dxa" w:w="110"/>
-            </w:tcMar>
-          </w:tcPr>
-          <w:p>
-            <w:r>
-              <w:rPr>
-                <w:rFonts w:ascii="Arial" w:cs="Arial" w:eastAsia="Arial" w:hAnsi="Arial"/>
-                <w:sz w:val="20"/>
-                <w:szCs w:val="20"/>
-              </w:rPr>
-              <w:t xml:space="preserve">2,99</w:t>
-            </w:r>
-          </w:p>
-        </w:tc>
-        <w:tc>
-          <w:tcPr>
-            <w:tcW w:type="dxa" w:w="935"/>
-            <w:tcBorders>
-              <w:top w:val="single" w:color="BBBBBB" w:sz="4"/>
-              <w:left w:val="single" w:color="BBBBBB" w:sz="4"/>
-              <w:bottom w:val="single" w:color="BBBBBB" w:sz="4"/>
-              <w:right w:val="single" w:color="BBBBBB" w:sz="4"/>
-            </w:tcBorders>
-            <w:tcMar>
-              <w:top w:type="dxa" w:w="70"/>
-              <w:left w:type="dxa" w:w="110"/>
-              <w:bottom w:type="dxa" w:w="70"/>
-              <w:right w:type="dxa" w:w="110"/>
-            </w:tcMar>
-          </w:tcPr>
-          <w:p>
-            <w:r>
-              <w:rPr>
-                <w:rFonts w:ascii="Arial" w:cs="Arial" w:eastAsia="Arial" w:hAnsi="Arial"/>
-                <w:sz w:val="20"/>
-                <w:szCs w:val="20"/>
-              </w:rPr>
-              <w:t xml:space="preserve">3,66</w:t>
-            </w:r>
-          </w:p>
-        </w:tc>
-        <w:tc>
-          <w:tcPr>
-            <w:tcW w:type="dxa" w:w="935"/>
-            <w:tcBorders>
-              <w:top w:val="single" w:color="BBBBBB" w:sz="4"/>
-              <w:left w:val="single" w:color="BBBBBB" w:sz="4"/>
-              <w:bottom w:val="single" w:color="BBBBBB" w:sz="4"/>
-              <w:right w:val="single" w:color="BBBBBB" w:sz="4"/>
-            </w:tcBorders>
-            <w:tcMar>
-              <w:top w:type="dxa" w:w="70"/>
-              <w:left w:type="dxa" w:w="110"/>
-              <w:bottom w:type="dxa" w:w="70"/>
-              <w:right w:type="dxa" w:w="110"/>
-            </w:tcMar>
-          </w:tcPr>
-          <w:p>
-            <w:r>
-              <w:rPr>
-                <w:rFonts w:ascii="Arial" w:cs="Arial" w:eastAsia="Arial" w:hAnsi="Arial"/>
-                <w:sz w:val="20"/>
-                <w:szCs w:val="20"/>
-              </w:rPr>
-              <w:t xml:space="preserve">4,97</w:t>
-            </w:r>
-          </w:p>
-        </w:tc>
-        <w:tc>
-          <w:tcPr>
-            <w:tcW w:type="dxa" w:w="5421"/>
-            <w:tcBorders>
-              <w:top w:val="single" w:color="BBBBBB" w:sz="4"/>
-              <w:left w:val="single" w:color="BBBBBB" w:sz="4"/>
-              <w:bottom w:val="single" w:color="BBBBBB" w:sz="4"/>
-              <w:right w:val="single" w:color="BBBBBB" w:sz="4"/>
-            </w:tcBorders>
-            <w:tcMar>
-              <w:top w:type="dxa" w:w="70"/>
-              <w:left w:type="dxa" w:w="110"/>
-              <w:bottom w:type="dxa" w:w="70"/>
-              <w:right w:type="dxa" w:w="110"/>
-            </w:tcMar>
-          </w:tcPr>
-          <w:p>
-            <w:r>
-              <w:rPr>
-                <w:rFonts w:ascii="Arial" w:cs="Arial" w:eastAsia="Arial" w:hAnsi="Arial"/>
-                <w:sz w:val="20"/>
-                <w:szCs w:val="20"/>
-              </w:rPr>
-              <w:t xml:space="preserve">4,07</w:t>
+            <w:tcW w:type="dxa" w:w="1922"/>
+            <w:tcBorders>
+              <w:top w:val="single" w:color="BBBBBB" w:sz="4"/>
+              <w:left w:val="single" w:color="BBBBBB" w:sz="4"/>
+              <w:bottom w:val="single" w:color="BBBBBB" w:sz="4"/>
+              <w:right w:val="single" w:color="BBBBBB" w:sz="4"/>
+            </w:tcBorders>
+            <w:tcMar>
+              <w:top w:type="dxa" w:w="70"/>
+              <w:left w:type="dxa" w:w="110"/>
+              <w:bottom w:type="dxa" w:w="70"/>
+              <w:right w:type="dxa" w:w="110"/>
+            </w:tcMar>
+          </w:tcPr>
+          <w:p>
+            <w:r>
+              <w:rPr>
+                <w:rFonts w:ascii="Arial" w:cs="Arial" w:eastAsia="Arial" w:hAnsi="Arial"/>
+                <w:sz w:val="20"/>
+                <w:szCs w:val="20"/>
+              </w:rPr>
+              <w:t xml:space="preserve">2,99 / 2,02</w:t>
+            </w:r>
+          </w:p>
+        </w:tc>
+        <w:tc>
+          <w:tcPr>
+            <w:tcW w:type="dxa" w:w="2057"/>
+            <w:tcBorders>
+              <w:top w:val="single" w:color="BBBBBB" w:sz="4"/>
+              <w:left w:val="single" w:color="BBBBBB" w:sz="4"/>
+              <w:bottom w:val="single" w:color="BBBBBB" w:sz="4"/>
+              <w:right w:val="single" w:color="BBBBBB" w:sz="4"/>
+            </w:tcBorders>
+            <w:tcMar>
+              <w:top w:type="dxa" w:w="70"/>
+              <w:left w:type="dxa" w:w="110"/>
+              <w:bottom w:type="dxa" w:w="70"/>
+              <w:right w:type="dxa" w:w="110"/>
+            </w:tcMar>
+          </w:tcPr>
+          <w:p>
+            <w:r>
+              <w:rPr>
+                <w:rFonts w:ascii="Arial" w:cs="Arial" w:eastAsia="Arial" w:hAnsi="Arial"/>
+                <w:sz w:val="20"/>
+                <w:szCs w:val="20"/>
+              </w:rPr>
+              <w:t xml:space="preserve">3,66 / 2,35</w:t>
+            </w:r>
+          </w:p>
+        </w:tc>
+        <w:tc>
+          <w:tcPr>
+            <w:tcW w:type="dxa" w:w="2057"/>
+            <w:tcBorders>
+              <w:top w:val="single" w:color="BBBBBB" w:sz="4"/>
+              <w:left w:val="single" w:color="BBBBBB" w:sz="4"/>
+              <w:bottom w:val="single" w:color="BBBBBB" w:sz="4"/>
+              <w:right w:val="single" w:color="BBBBBB" w:sz="4"/>
+            </w:tcBorders>
+            <w:tcMar>
+              <w:top w:type="dxa" w:w="70"/>
+              <w:left w:type="dxa" w:w="110"/>
+              <w:bottom w:type="dxa" w:w="70"/>
+              <w:right w:type="dxa" w:w="110"/>
+            </w:tcMar>
+          </w:tcPr>
+          <w:p>
+            <w:r>
+              <w:rPr>
+                <w:rFonts w:ascii="Arial" w:cs="Arial" w:eastAsia="Arial" w:hAnsi="Arial"/>
+                <w:sz w:val="20"/>
+                <w:szCs w:val="20"/>
+              </w:rPr>
+              <w:t xml:space="preserve">4,97 / 3,14</w:t>
+            </w:r>
+          </w:p>
+        </w:tc>
+        <w:tc>
+          <w:tcPr>
+            <w:tcW w:type="dxa" w:w="2055"/>
+            <w:tcBorders>
+              <w:top w:val="single" w:color="BBBBBB" w:sz="4"/>
+              <w:left w:val="single" w:color="BBBBBB" w:sz="4"/>
+              <w:bottom w:val="single" w:color="BBBBBB" w:sz="4"/>
+              <w:right w:val="single" w:color="BBBBBB" w:sz="4"/>
+            </w:tcBorders>
+            <w:tcMar>
+              <w:top w:type="dxa" w:w="70"/>
+              <w:left w:type="dxa" w:w="110"/>
+              <w:bottom w:type="dxa" w:w="70"/>
+              <w:right w:type="dxa" w:w="110"/>
+            </w:tcMar>
+          </w:tcPr>
+          <w:p>
+            <w:r>
+              <w:rPr>
+                <w:rFonts w:ascii="Arial" w:cs="Arial" w:eastAsia="Arial" w:hAnsi="Arial"/>
+                <w:sz w:val="20"/>
+                <w:szCs w:val="20"/>
+              </w:rPr>
+              <w:t xml:space="preserve">4,07 / 2,43</w:t>
             </w:r>
           </w:p>
         </w:tc>
@@ -4916,109 +5960,109 @@
         </w:tc>
         <w:tc>
           <w:tcPr>
-            <w:tcW w:type="dxa" w:w="800"/>
-            <w:tcBorders>
-              <w:top w:val="single" w:color="BBBBBB" w:sz="4"/>
-              <w:left w:val="single" w:color="BBBBBB" w:sz="4"/>
-              <w:bottom w:val="single" w:color="BBBBBB" w:sz="4"/>
-              <w:right w:val="single" w:color="BBBBBB" w:sz="4"/>
-            </w:tcBorders>
-            <w:tcMar>
-              <w:top w:type="dxa" w:w="70"/>
-              <w:left w:type="dxa" w:w="110"/>
-              <w:bottom w:type="dxa" w:w="70"/>
-              <w:right w:type="dxa" w:w="110"/>
-            </w:tcMar>
-          </w:tcPr>
-          <w:p>
-            <w:r>
-              <w:rPr>
-                <w:rFonts w:ascii="Arial" w:cs="Arial" w:eastAsia="Arial" w:hAnsi="Arial"/>
-                <w:sz w:val="20"/>
-                <w:szCs w:val="20"/>
-              </w:rPr>
-              <w:t xml:space="preserve">0,33</w:t>
-            </w:r>
-          </w:p>
-        </w:tc>
-        <w:tc>
-          <w:tcPr>
-            <w:tcW w:type="dxa" w:w="935"/>
-            <w:tcBorders>
-              <w:top w:val="single" w:color="BBBBBB" w:sz="4"/>
-              <w:left w:val="single" w:color="BBBBBB" w:sz="4"/>
-              <w:bottom w:val="single" w:color="BBBBBB" w:sz="4"/>
-              <w:right w:val="single" w:color="BBBBBB" w:sz="4"/>
-            </w:tcBorders>
-            <w:tcMar>
-              <w:top w:type="dxa" w:w="70"/>
-              <w:left w:type="dxa" w:w="110"/>
-              <w:bottom w:type="dxa" w:w="70"/>
-              <w:right w:type="dxa" w:w="110"/>
-            </w:tcMar>
-          </w:tcPr>
-          <w:p>
-            <w:r>
-              <w:rPr>
-                <w:rFonts w:ascii="Arial" w:cs="Arial" w:eastAsia="Arial" w:hAnsi="Arial"/>
-                <w:sz w:val="20"/>
-                <w:szCs w:val="20"/>
-              </w:rPr>
-              <w:t xml:space="preserve">0,53</w:t>
-            </w:r>
-          </w:p>
-        </w:tc>
-        <w:tc>
-          <w:tcPr>
-            <w:tcW w:type="dxa" w:w="935"/>
-            <w:tcBorders>
-              <w:top w:val="single" w:color="BBBBBB" w:sz="4"/>
-              <w:left w:val="single" w:color="BBBBBB" w:sz="4"/>
-              <w:bottom w:val="single" w:color="BBBBBB" w:sz="4"/>
-              <w:right w:val="single" w:color="BBBBBB" w:sz="4"/>
-            </w:tcBorders>
-            <w:tcMar>
-              <w:top w:type="dxa" w:w="70"/>
-              <w:left w:type="dxa" w:w="110"/>
-              <w:bottom w:type="dxa" w:w="70"/>
-              <w:right w:type="dxa" w:w="110"/>
-            </w:tcMar>
-          </w:tcPr>
-          <w:p>
-            <w:r>
-              <w:rPr>
-                <w:rFonts w:ascii="Arial" w:cs="Arial" w:eastAsia="Arial" w:hAnsi="Arial"/>
-                <w:sz w:val="20"/>
-                <w:szCs w:val="20"/>
-              </w:rPr>
-              <w:t xml:space="preserve">0,67</w:t>
-            </w:r>
-          </w:p>
-        </w:tc>
-        <w:tc>
-          <w:tcPr>
-            <w:tcW w:type="dxa" w:w="5421"/>
-            <w:tcBorders>
-              <w:top w:val="single" w:color="BBBBBB" w:sz="4"/>
-              <w:left w:val="single" w:color="BBBBBB" w:sz="4"/>
-              <w:bottom w:val="single" w:color="BBBBBB" w:sz="4"/>
-              <w:right w:val="single" w:color="BBBBBB" w:sz="4"/>
-            </w:tcBorders>
-            <w:tcMar>
-              <w:top w:type="dxa" w:w="70"/>
-              <w:left w:type="dxa" w:w="110"/>
-              <w:bottom w:type="dxa" w:w="70"/>
-              <w:right w:type="dxa" w:w="110"/>
-            </w:tcMar>
-          </w:tcPr>
-          <w:p>
-            <w:r>
-              <w:rPr>
-                <w:rFonts w:ascii="Arial" w:cs="Arial" w:eastAsia="Arial" w:hAnsi="Arial"/>
-                <w:sz w:val="20"/>
-                <w:szCs w:val="20"/>
-              </w:rPr>
-              <w:t xml:space="preserve">0,44</w:t>
+            <w:tcW w:type="dxa" w:w="1922"/>
+            <w:tcBorders>
+              <w:top w:val="single" w:color="BBBBBB" w:sz="4"/>
+              <w:left w:val="single" w:color="BBBBBB" w:sz="4"/>
+              <w:bottom w:val="single" w:color="BBBBBB" w:sz="4"/>
+              <w:right w:val="single" w:color="BBBBBB" w:sz="4"/>
+            </w:tcBorders>
+            <w:tcMar>
+              <w:top w:type="dxa" w:w="70"/>
+              <w:left w:type="dxa" w:w="110"/>
+              <w:bottom w:type="dxa" w:w="70"/>
+              <w:right w:type="dxa" w:w="110"/>
+            </w:tcMar>
+          </w:tcPr>
+          <w:p>
+            <w:r>
+              <w:rPr>
+                <w:rFonts w:ascii="Arial" w:cs="Arial" w:eastAsia="Arial" w:hAnsi="Arial"/>
+                <w:sz w:val="20"/>
+                <w:szCs w:val="20"/>
+              </w:rPr>
+              <w:t xml:space="preserve">0,33 / 0,25</w:t>
+            </w:r>
+          </w:p>
+        </w:tc>
+        <w:tc>
+          <w:tcPr>
+            <w:tcW w:type="dxa" w:w="2057"/>
+            <w:tcBorders>
+              <w:top w:val="single" w:color="BBBBBB" w:sz="4"/>
+              <w:left w:val="single" w:color="BBBBBB" w:sz="4"/>
+              <w:bottom w:val="single" w:color="BBBBBB" w:sz="4"/>
+              <w:right w:val="single" w:color="BBBBBB" w:sz="4"/>
+            </w:tcBorders>
+            <w:tcMar>
+              <w:top w:type="dxa" w:w="70"/>
+              <w:left w:type="dxa" w:w="110"/>
+              <w:bottom w:type="dxa" w:w="70"/>
+              <w:right w:type="dxa" w:w="110"/>
+            </w:tcMar>
+          </w:tcPr>
+          <w:p>
+            <w:r>
+              <w:rPr>
+                <w:rFonts w:ascii="Arial" w:cs="Arial" w:eastAsia="Arial" w:hAnsi="Arial"/>
+                <w:sz w:val="20"/>
+                <w:szCs w:val="20"/>
+              </w:rPr>
+              <w:t xml:space="preserve">0,53 / 0,33</w:t>
+            </w:r>
+          </w:p>
+        </w:tc>
+        <w:tc>
+          <w:tcPr>
+            <w:tcW w:type="dxa" w:w="2057"/>
+            <w:tcBorders>
+              <w:top w:val="single" w:color="BBBBBB" w:sz="4"/>
+              <w:left w:val="single" w:color="BBBBBB" w:sz="4"/>
+              <w:bottom w:val="single" w:color="BBBBBB" w:sz="4"/>
+              <w:right w:val="single" w:color="BBBBBB" w:sz="4"/>
+            </w:tcBorders>
+            <w:tcMar>
+              <w:top w:type="dxa" w:w="70"/>
+              <w:left w:type="dxa" w:w="110"/>
+              <w:bottom w:type="dxa" w:w="70"/>
+              <w:right w:type="dxa" w:w="110"/>
+            </w:tcMar>
+          </w:tcPr>
+          <w:p>
+            <w:r>
+              <w:rPr>
+                <w:rFonts w:ascii="Arial" w:cs="Arial" w:eastAsia="Arial" w:hAnsi="Arial"/>
+                <w:sz w:val="20"/>
+                <w:szCs w:val="20"/>
+              </w:rPr>
+              <w:t xml:space="preserve">0,67 / 0,46</w:t>
+            </w:r>
+          </w:p>
+        </w:tc>
+        <w:tc>
+          <w:tcPr>
+            <w:tcW w:type="dxa" w:w="2055"/>
+            <w:tcBorders>
+              <w:top w:val="single" w:color="BBBBBB" w:sz="4"/>
+              <w:left w:val="single" w:color="BBBBBB" w:sz="4"/>
+              <w:bottom w:val="single" w:color="BBBBBB" w:sz="4"/>
+              <w:right w:val="single" w:color="BBBBBB" w:sz="4"/>
+            </w:tcBorders>
+            <w:tcMar>
+              <w:top w:type="dxa" w:w="70"/>
+              <w:left w:type="dxa" w:w="110"/>
+              <w:bottom w:type="dxa" w:w="70"/>
+              <w:right w:type="dxa" w:w="110"/>
+            </w:tcMar>
+          </w:tcPr>
+          <w:p>
+            <w:r>
+              <w:rPr>
+                <w:rFonts w:ascii="Arial" w:cs="Arial" w:eastAsia="Arial" w:hAnsi="Arial"/>
+                <w:sz w:val="20"/>
+                <w:szCs w:val="20"/>
+              </w:rPr>
+              <w:t xml:space="preserve">0,44 / 0,29</w:t>
             </w:r>
           </w:p>
         </w:tc>
@@ -5056,109 +6100,109 @@
         </w:tc>
         <w:tc>
           <w:tcPr>
-            <w:tcW w:type="dxa" w:w="800"/>
-            <w:tcBorders>
-              <w:top w:val="single" w:color="BBBBBB" w:sz="4"/>
-              <w:left w:val="single" w:color="BBBBBB" w:sz="4"/>
-              <w:bottom w:val="single" w:color="BBBBBB" w:sz="4"/>
-              <w:right w:val="single" w:color="BBBBBB" w:sz="4"/>
-            </w:tcBorders>
-            <w:tcMar>
-              <w:top w:type="dxa" w:w="70"/>
-              <w:left w:type="dxa" w:w="110"/>
-              <w:bottom w:type="dxa" w:w="70"/>
-              <w:right w:type="dxa" w:w="110"/>
-            </w:tcMar>
-          </w:tcPr>
-          <w:p>
-            <w:r>
-              <w:rPr>
-                <w:rFonts w:ascii="Arial" w:cs="Arial" w:eastAsia="Arial" w:hAnsi="Arial"/>
-                <w:sz w:val="20"/>
-                <w:szCs w:val="20"/>
-              </w:rPr>
-              <w:t xml:space="preserve">0,35</w:t>
-            </w:r>
-          </w:p>
-        </w:tc>
-        <w:tc>
-          <w:tcPr>
-            <w:tcW w:type="dxa" w:w="935"/>
-            <w:tcBorders>
-              <w:top w:val="single" w:color="BBBBBB" w:sz="4"/>
-              <w:left w:val="single" w:color="BBBBBB" w:sz="4"/>
-              <w:bottom w:val="single" w:color="BBBBBB" w:sz="4"/>
-              <w:right w:val="single" w:color="BBBBBB" w:sz="4"/>
-            </w:tcBorders>
-            <w:tcMar>
-              <w:top w:type="dxa" w:w="70"/>
-              <w:left w:type="dxa" w:w="110"/>
-              <w:bottom w:type="dxa" w:w="70"/>
-              <w:right w:type="dxa" w:w="110"/>
-            </w:tcMar>
-          </w:tcPr>
-          <w:p>
-            <w:r>
-              <w:rPr>
-                <w:rFonts w:ascii="Arial" w:cs="Arial" w:eastAsia="Arial" w:hAnsi="Arial"/>
-                <w:sz w:val="20"/>
-                <w:szCs w:val="20"/>
-              </w:rPr>
-              <w:t xml:space="preserve">0,73</w:t>
-            </w:r>
-          </w:p>
-        </w:tc>
-        <w:tc>
-          <w:tcPr>
-            <w:tcW w:type="dxa" w:w="935"/>
-            <w:tcBorders>
-              <w:top w:val="single" w:color="BBBBBB" w:sz="4"/>
-              <w:left w:val="single" w:color="BBBBBB" w:sz="4"/>
-              <w:bottom w:val="single" w:color="BBBBBB" w:sz="4"/>
-              <w:right w:val="single" w:color="BBBBBB" w:sz="4"/>
-            </w:tcBorders>
-            <w:tcMar>
-              <w:top w:type="dxa" w:w="70"/>
-              <w:left w:type="dxa" w:w="110"/>
-              <w:bottom w:type="dxa" w:w="70"/>
-              <w:right w:type="dxa" w:w="110"/>
-            </w:tcMar>
-          </w:tcPr>
-          <w:p>
-            <w:r>
-              <w:rPr>
-                <w:rFonts w:ascii="Arial" w:cs="Arial" w:eastAsia="Arial" w:hAnsi="Arial"/>
-                <w:sz w:val="20"/>
-                <w:szCs w:val="20"/>
-              </w:rPr>
-              <w:t xml:space="preserve">0,74</w:t>
-            </w:r>
-          </w:p>
-        </w:tc>
-        <w:tc>
-          <w:tcPr>
-            <w:tcW w:type="dxa" w:w="5421"/>
-            <w:tcBorders>
-              <w:top w:val="single" w:color="BBBBBB" w:sz="4"/>
-              <w:left w:val="single" w:color="BBBBBB" w:sz="4"/>
-              <w:bottom w:val="single" w:color="BBBBBB" w:sz="4"/>
-              <w:right w:val="single" w:color="BBBBBB" w:sz="4"/>
-            </w:tcBorders>
-            <w:tcMar>
-              <w:top w:type="dxa" w:w="70"/>
-              <w:left w:type="dxa" w:w="110"/>
-              <w:bottom w:type="dxa" w:w="70"/>
-              <w:right w:type="dxa" w:w="110"/>
-            </w:tcMar>
-          </w:tcPr>
-          <w:p>
-            <w:r>
-              <w:rPr>
-                <w:rFonts w:ascii="Arial" w:cs="Arial" w:eastAsia="Arial" w:hAnsi="Arial"/>
-                <w:sz w:val="20"/>
-                <w:szCs w:val="20"/>
-              </w:rPr>
-              <w:t xml:space="preserve">0,44</w:t>
+            <w:tcW w:type="dxa" w:w="1922"/>
+            <w:tcBorders>
+              <w:top w:val="single" w:color="BBBBBB" w:sz="4"/>
+              <w:left w:val="single" w:color="BBBBBB" w:sz="4"/>
+              <w:bottom w:val="single" w:color="BBBBBB" w:sz="4"/>
+              <w:right w:val="single" w:color="BBBBBB" w:sz="4"/>
+            </w:tcBorders>
+            <w:tcMar>
+              <w:top w:type="dxa" w:w="70"/>
+              <w:left w:type="dxa" w:w="110"/>
+              <w:bottom w:type="dxa" w:w="70"/>
+              <w:right w:type="dxa" w:w="110"/>
+            </w:tcMar>
+          </w:tcPr>
+          <w:p>
+            <w:r>
+              <w:rPr>
+                <w:rFonts w:ascii="Arial" w:cs="Arial" w:eastAsia="Arial" w:hAnsi="Arial"/>
+                <w:sz w:val="20"/>
+                <w:szCs w:val="20"/>
+              </w:rPr>
+              <w:t xml:space="preserve">0,35 / 0,28</w:t>
+            </w:r>
+          </w:p>
+        </w:tc>
+        <w:tc>
+          <w:tcPr>
+            <w:tcW w:type="dxa" w:w="2057"/>
+            <w:tcBorders>
+              <w:top w:val="single" w:color="BBBBBB" w:sz="4"/>
+              <w:left w:val="single" w:color="BBBBBB" w:sz="4"/>
+              <w:bottom w:val="single" w:color="BBBBBB" w:sz="4"/>
+              <w:right w:val="single" w:color="BBBBBB" w:sz="4"/>
+            </w:tcBorders>
+            <w:tcMar>
+              <w:top w:type="dxa" w:w="70"/>
+              <w:left w:type="dxa" w:w="110"/>
+              <w:bottom w:type="dxa" w:w="70"/>
+              <w:right w:type="dxa" w:w="110"/>
+            </w:tcMar>
+          </w:tcPr>
+          <w:p>
+            <w:r>
+              <w:rPr>
+                <w:rFonts w:ascii="Arial" w:cs="Arial" w:eastAsia="Arial" w:hAnsi="Arial"/>
+                <w:sz w:val="20"/>
+                <w:szCs w:val="20"/>
+              </w:rPr>
+              <w:t xml:space="preserve">0,73 / 0,36</w:t>
+            </w:r>
+          </w:p>
+        </w:tc>
+        <w:tc>
+          <w:tcPr>
+            <w:tcW w:type="dxa" w:w="2057"/>
+            <w:tcBorders>
+              <w:top w:val="single" w:color="BBBBBB" w:sz="4"/>
+              <w:left w:val="single" w:color="BBBBBB" w:sz="4"/>
+              <w:bottom w:val="single" w:color="BBBBBB" w:sz="4"/>
+              <w:right w:val="single" w:color="BBBBBB" w:sz="4"/>
+            </w:tcBorders>
+            <w:tcMar>
+              <w:top w:type="dxa" w:w="70"/>
+              <w:left w:type="dxa" w:w="110"/>
+              <w:bottom w:type="dxa" w:w="70"/>
+              <w:right w:type="dxa" w:w="110"/>
+            </w:tcMar>
+          </w:tcPr>
+          <w:p>
+            <w:r>
+              <w:rPr>
+                <w:rFonts w:ascii="Arial" w:cs="Arial" w:eastAsia="Arial" w:hAnsi="Arial"/>
+                <w:sz w:val="20"/>
+                <w:szCs w:val="20"/>
+              </w:rPr>
+              <w:t xml:space="preserve">0,74 / 0,43</w:t>
+            </w:r>
+          </w:p>
+        </w:tc>
+        <w:tc>
+          <w:tcPr>
+            <w:tcW w:type="dxa" w:w="2055"/>
+            <w:tcBorders>
+              <w:top w:val="single" w:color="BBBBBB" w:sz="4"/>
+              <w:left w:val="single" w:color="BBBBBB" w:sz="4"/>
+              <w:bottom w:val="single" w:color="BBBBBB" w:sz="4"/>
+              <w:right w:val="single" w:color="BBBBBB" w:sz="4"/>
+            </w:tcBorders>
+            <w:tcMar>
+              <w:top w:type="dxa" w:w="70"/>
+              <w:left w:type="dxa" w:w="110"/>
+              <w:bottom w:type="dxa" w:w="70"/>
+              <w:right w:type="dxa" w:w="110"/>
+            </w:tcMar>
+          </w:tcPr>
+          <w:p>
+            <w:r>
+              <w:rPr>
+                <w:rFonts w:ascii="Arial" w:cs="Arial" w:eastAsia="Arial" w:hAnsi="Arial"/>
+                <w:sz w:val="20"/>
+                <w:szCs w:val="20"/>
+              </w:rPr>
+              <w:t xml:space="preserve">0,44 / 0,30</w:t>
             </w:r>
           </w:p>
         </w:tc>
@@ -5196,109 +6240,109 @@
         </w:tc>
         <w:tc>
           <w:tcPr>
-            <w:tcW w:type="dxa" w:w="800"/>
-            <w:tcBorders>
-              <w:top w:val="single" w:color="BBBBBB" w:sz="4"/>
-              <w:left w:val="single" w:color="BBBBBB" w:sz="4"/>
-              <w:bottom w:val="single" w:color="BBBBBB" w:sz="4"/>
-              <w:right w:val="single" w:color="BBBBBB" w:sz="4"/>
-            </w:tcBorders>
-            <w:tcMar>
-              <w:top w:type="dxa" w:w="70"/>
-              <w:left w:type="dxa" w:w="110"/>
-              <w:bottom w:type="dxa" w:w="70"/>
-              <w:right w:type="dxa" w:w="110"/>
-            </w:tcMar>
-          </w:tcPr>
-          <w:p>
-            <w:r>
-              <w:rPr>
-                <w:rFonts w:ascii="Arial" w:cs="Arial" w:eastAsia="Arial" w:hAnsi="Arial"/>
-                <w:sz w:val="20"/>
-                <w:szCs w:val="20"/>
-              </w:rPr>
-              <w:t xml:space="preserve">0,60</w:t>
-            </w:r>
-          </w:p>
-        </w:tc>
-        <w:tc>
-          <w:tcPr>
-            <w:tcW w:type="dxa" w:w="935"/>
-            <w:tcBorders>
-              <w:top w:val="single" w:color="BBBBBB" w:sz="4"/>
-              <w:left w:val="single" w:color="BBBBBB" w:sz="4"/>
-              <w:bottom w:val="single" w:color="BBBBBB" w:sz="4"/>
-              <w:right w:val="single" w:color="BBBBBB" w:sz="4"/>
-            </w:tcBorders>
-            <w:tcMar>
-              <w:top w:type="dxa" w:w="70"/>
-              <w:left w:type="dxa" w:w="110"/>
-              <w:bottom w:type="dxa" w:w="70"/>
-              <w:right w:type="dxa" w:w="110"/>
-            </w:tcMar>
-          </w:tcPr>
-          <w:p>
-            <w:r>
-              <w:rPr>
-                <w:rFonts w:ascii="Arial" w:cs="Arial" w:eastAsia="Arial" w:hAnsi="Arial"/>
-                <w:sz w:val="20"/>
-                <w:szCs w:val="20"/>
-              </w:rPr>
-              <w:t xml:space="preserve">0,78</w:t>
-            </w:r>
-          </w:p>
-        </w:tc>
-        <w:tc>
-          <w:tcPr>
-            <w:tcW w:type="dxa" w:w="935"/>
-            <w:tcBorders>
-              <w:top w:val="single" w:color="BBBBBB" w:sz="4"/>
-              <w:left w:val="single" w:color="BBBBBB" w:sz="4"/>
-              <w:bottom w:val="single" w:color="BBBBBB" w:sz="4"/>
-              <w:right w:val="single" w:color="BBBBBB" w:sz="4"/>
-            </w:tcBorders>
-            <w:tcMar>
-              <w:top w:type="dxa" w:w="70"/>
-              <w:left w:type="dxa" w:w="110"/>
-              <w:bottom w:type="dxa" w:w="70"/>
-              <w:right w:type="dxa" w:w="110"/>
-            </w:tcMar>
-          </w:tcPr>
-          <w:p>
-            <w:r>
-              <w:rPr>
-                <w:rFonts w:ascii="Arial" w:cs="Arial" w:eastAsia="Arial" w:hAnsi="Arial"/>
-                <w:sz w:val="20"/>
-                <w:szCs w:val="20"/>
-              </w:rPr>
-              <w:t xml:space="preserve">1,13</w:t>
-            </w:r>
-          </w:p>
-        </w:tc>
-        <w:tc>
-          <w:tcPr>
-            <w:tcW w:type="dxa" w:w="5421"/>
-            <w:tcBorders>
-              <w:top w:val="single" w:color="BBBBBB" w:sz="4"/>
-              <w:left w:val="single" w:color="BBBBBB" w:sz="4"/>
-              <w:bottom w:val="single" w:color="BBBBBB" w:sz="4"/>
-              <w:right w:val="single" w:color="BBBBBB" w:sz="4"/>
-            </w:tcBorders>
-            <w:tcMar>
-              <w:top w:type="dxa" w:w="70"/>
-              <w:left w:type="dxa" w:w="110"/>
-              <w:bottom w:type="dxa" w:w="70"/>
-              <w:right w:type="dxa" w:w="110"/>
-            </w:tcMar>
-          </w:tcPr>
-          <w:p>
-            <w:r>
-              <w:rPr>
-                <w:rFonts w:ascii="Arial" w:cs="Arial" w:eastAsia="Arial" w:hAnsi="Arial"/>
-                <w:sz w:val="20"/>
-                <w:szCs w:val="20"/>
-              </w:rPr>
-              <w:t xml:space="preserve">0,80</w:t>
+            <w:tcW w:type="dxa" w:w="1922"/>
+            <w:tcBorders>
+              <w:top w:val="single" w:color="BBBBBB" w:sz="4"/>
+              <w:left w:val="single" w:color="BBBBBB" w:sz="4"/>
+              <w:bottom w:val="single" w:color="BBBBBB" w:sz="4"/>
+              <w:right w:val="single" w:color="BBBBBB" w:sz="4"/>
+            </w:tcBorders>
+            <w:tcMar>
+              <w:top w:type="dxa" w:w="70"/>
+              <w:left w:type="dxa" w:w="110"/>
+              <w:bottom w:type="dxa" w:w="70"/>
+              <w:right w:type="dxa" w:w="110"/>
+            </w:tcMar>
+          </w:tcPr>
+          <w:p>
+            <w:r>
+              <w:rPr>
+                <w:rFonts w:ascii="Arial" w:cs="Arial" w:eastAsia="Arial" w:hAnsi="Arial"/>
+                <w:sz w:val="20"/>
+                <w:szCs w:val="20"/>
+              </w:rPr>
+              <w:t xml:space="preserve">0,60 / 0,45</w:t>
+            </w:r>
+          </w:p>
+        </w:tc>
+        <w:tc>
+          <w:tcPr>
+            <w:tcW w:type="dxa" w:w="2057"/>
+            <w:tcBorders>
+              <w:top w:val="single" w:color="BBBBBB" w:sz="4"/>
+              <w:left w:val="single" w:color="BBBBBB" w:sz="4"/>
+              <w:bottom w:val="single" w:color="BBBBBB" w:sz="4"/>
+              <w:right w:val="single" w:color="BBBBBB" w:sz="4"/>
+            </w:tcBorders>
+            <w:tcMar>
+              <w:top w:type="dxa" w:w="70"/>
+              <w:left w:type="dxa" w:w="110"/>
+              <w:bottom w:type="dxa" w:w="70"/>
+              <w:right w:type="dxa" w:w="110"/>
+            </w:tcMar>
+          </w:tcPr>
+          <w:p>
+            <w:r>
+              <w:rPr>
+                <w:rFonts w:ascii="Arial" w:cs="Arial" w:eastAsia="Arial" w:hAnsi="Arial"/>
+                <w:sz w:val="20"/>
+                <w:szCs w:val="20"/>
+              </w:rPr>
+              <w:t xml:space="preserve">0,78 / 0,52</w:t>
+            </w:r>
+          </w:p>
+        </w:tc>
+        <w:tc>
+          <w:tcPr>
+            <w:tcW w:type="dxa" w:w="2057"/>
+            <w:tcBorders>
+              <w:top w:val="single" w:color="BBBBBB" w:sz="4"/>
+              <w:left w:val="single" w:color="BBBBBB" w:sz="4"/>
+              <w:bottom w:val="single" w:color="BBBBBB" w:sz="4"/>
+              <w:right w:val="single" w:color="BBBBBB" w:sz="4"/>
+            </w:tcBorders>
+            <w:tcMar>
+              <w:top w:type="dxa" w:w="70"/>
+              <w:left w:type="dxa" w:w="110"/>
+              <w:bottom w:type="dxa" w:w="70"/>
+              <w:right w:type="dxa" w:w="110"/>
+            </w:tcMar>
+          </w:tcPr>
+          <w:p>
+            <w:r>
+              <w:rPr>
+                <w:rFonts w:ascii="Arial" w:cs="Arial" w:eastAsia="Arial" w:hAnsi="Arial"/>
+                <w:sz w:val="20"/>
+                <w:szCs w:val="20"/>
+              </w:rPr>
+              <w:t xml:space="preserve">1,13 / 0,67</w:t>
+            </w:r>
+          </w:p>
+        </w:tc>
+        <w:tc>
+          <w:tcPr>
+            <w:tcW w:type="dxa" w:w="2055"/>
+            <w:tcBorders>
+              <w:top w:val="single" w:color="BBBBBB" w:sz="4"/>
+              <w:left w:val="single" w:color="BBBBBB" w:sz="4"/>
+              <w:bottom w:val="single" w:color="BBBBBB" w:sz="4"/>
+              <w:right w:val="single" w:color="BBBBBB" w:sz="4"/>
+            </w:tcBorders>
+            <w:tcMar>
+              <w:top w:type="dxa" w:w="70"/>
+              <w:left w:type="dxa" w:w="110"/>
+              <w:bottom w:type="dxa" w:w="70"/>
+              <w:right w:type="dxa" w:w="110"/>
+            </w:tcMar>
+          </w:tcPr>
+          <w:p>
+            <w:r>
+              <w:rPr>
+                <w:rFonts w:ascii="Arial" w:cs="Arial" w:eastAsia="Arial" w:hAnsi="Arial"/>
+                <w:sz w:val="20"/>
+                <w:szCs w:val="20"/>
+              </w:rPr>
+              <w:t xml:space="preserve">0,80 / 0,54</w:t>
             </w:r>
           </w:p>
         </w:tc>
@@ -5336,109 +6380,109 @@
         </w:tc>
         <w:tc>
           <w:tcPr>
-            <w:tcW w:type="dxa" w:w="800"/>
-            <w:tcBorders>
-              <w:top w:val="single" w:color="BBBBBB" w:sz="4"/>
-              <w:left w:val="single" w:color="BBBBBB" w:sz="4"/>
-              <w:bottom w:val="single" w:color="BBBBBB" w:sz="4"/>
-              <w:right w:val="single" w:color="BBBBBB" w:sz="4"/>
-            </w:tcBorders>
-            <w:tcMar>
-              <w:top w:type="dxa" w:w="70"/>
-              <w:left w:type="dxa" w:w="110"/>
-              <w:bottom w:type="dxa" w:w="70"/>
-              <w:right w:type="dxa" w:w="110"/>
-            </w:tcMar>
-          </w:tcPr>
-          <w:p>
-            <w:r>
-              <w:rPr>
-                <w:rFonts w:ascii="Arial" w:cs="Arial" w:eastAsia="Arial" w:hAnsi="Arial"/>
-                <w:sz w:val="20"/>
-                <w:szCs w:val="20"/>
-              </w:rPr>
-              <w:t xml:space="preserve">1,07</w:t>
-            </w:r>
-          </w:p>
-        </w:tc>
-        <w:tc>
-          <w:tcPr>
-            <w:tcW w:type="dxa" w:w="935"/>
-            <w:tcBorders>
-              <w:top w:val="single" w:color="BBBBBB" w:sz="4"/>
-              <w:left w:val="single" w:color="BBBBBB" w:sz="4"/>
-              <w:bottom w:val="single" w:color="BBBBBB" w:sz="4"/>
-              <w:right w:val="single" w:color="BBBBBB" w:sz="4"/>
-            </w:tcBorders>
-            <w:tcMar>
-              <w:top w:type="dxa" w:w="70"/>
-              <w:left w:type="dxa" w:w="110"/>
-              <w:bottom w:type="dxa" w:w="70"/>
-              <w:right w:type="dxa" w:w="110"/>
-            </w:tcMar>
-          </w:tcPr>
-          <w:p>
-            <w:r>
-              <w:rPr>
-                <w:rFonts w:ascii="Arial" w:cs="Arial" w:eastAsia="Arial" w:hAnsi="Arial"/>
-                <w:sz w:val="20"/>
-                <w:szCs w:val="20"/>
-              </w:rPr>
-              <w:t xml:space="preserve">1,41</w:t>
-            </w:r>
-          </w:p>
-        </w:tc>
-        <w:tc>
-          <w:tcPr>
-            <w:tcW w:type="dxa" w:w="935"/>
-            <w:tcBorders>
-              <w:top w:val="single" w:color="BBBBBB" w:sz="4"/>
-              <w:left w:val="single" w:color="BBBBBB" w:sz="4"/>
-              <w:bottom w:val="single" w:color="BBBBBB" w:sz="4"/>
-              <w:right w:val="single" w:color="BBBBBB" w:sz="4"/>
-            </w:tcBorders>
-            <w:tcMar>
-              <w:top w:type="dxa" w:w="70"/>
-              <w:left w:type="dxa" w:w="110"/>
-              <w:bottom w:type="dxa" w:w="70"/>
-              <w:right w:type="dxa" w:w="110"/>
-            </w:tcMar>
-          </w:tcPr>
-          <w:p>
-            <w:r>
-              <w:rPr>
-                <w:rFonts w:ascii="Arial" w:cs="Arial" w:eastAsia="Arial" w:hAnsi="Arial"/>
-                <w:sz w:val="20"/>
-                <w:szCs w:val="20"/>
-              </w:rPr>
-              <w:t xml:space="preserve">2,10</w:t>
-            </w:r>
-          </w:p>
-        </w:tc>
-        <w:tc>
-          <w:tcPr>
-            <w:tcW w:type="dxa" w:w="5421"/>
-            <w:tcBorders>
-              <w:top w:val="single" w:color="BBBBBB" w:sz="4"/>
-              <w:left w:val="single" w:color="BBBBBB" w:sz="4"/>
-              <w:bottom w:val="single" w:color="BBBBBB" w:sz="4"/>
-              <w:right w:val="single" w:color="BBBBBB" w:sz="4"/>
-            </w:tcBorders>
-            <w:tcMar>
-              <w:top w:type="dxa" w:w="70"/>
-              <w:left w:type="dxa" w:w="110"/>
-              <w:bottom w:type="dxa" w:w="70"/>
-              <w:right w:type="dxa" w:w="110"/>
-            </w:tcMar>
-          </w:tcPr>
-          <w:p>
-            <w:r>
-              <w:rPr>
-                <w:rFonts w:ascii="Arial" w:cs="Arial" w:eastAsia="Arial" w:hAnsi="Arial"/>
-                <w:sz w:val="20"/>
-                <w:szCs w:val="20"/>
-              </w:rPr>
-              <w:t xml:space="preserve">1,34</w:t>
+            <w:tcW w:type="dxa" w:w="1922"/>
+            <w:tcBorders>
+              <w:top w:val="single" w:color="BBBBBB" w:sz="4"/>
+              <w:left w:val="single" w:color="BBBBBB" w:sz="4"/>
+              <w:bottom w:val="single" w:color="BBBBBB" w:sz="4"/>
+              <w:right w:val="single" w:color="BBBBBB" w:sz="4"/>
+            </w:tcBorders>
+            <w:tcMar>
+              <w:top w:type="dxa" w:w="70"/>
+              <w:left w:type="dxa" w:w="110"/>
+              <w:bottom w:type="dxa" w:w="70"/>
+              <w:right w:type="dxa" w:w="110"/>
+            </w:tcMar>
+          </w:tcPr>
+          <w:p>
+            <w:r>
+              <w:rPr>
+                <w:rFonts w:ascii="Arial" w:cs="Arial" w:eastAsia="Arial" w:hAnsi="Arial"/>
+                <w:sz w:val="20"/>
+                <w:szCs w:val="20"/>
+              </w:rPr>
+              <w:t xml:space="preserve">1,07 / 0,83</w:t>
+            </w:r>
+          </w:p>
+        </w:tc>
+        <w:tc>
+          <w:tcPr>
+            <w:tcW w:type="dxa" w:w="2057"/>
+            <w:tcBorders>
+              <w:top w:val="single" w:color="BBBBBB" w:sz="4"/>
+              <w:left w:val="single" w:color="BBBBBB" w:sz="4"/>
+              <w:bottom w:val="single" w:color="BBBBBB" w:sz="4"/>
+              <w:right w:val="single" w:color="BBBBBB" w:sz="4"/>
+            </w:tcBorders>
+            <w:tcMar>
+              <w:top w:type="dxa" w:w="70"/>
+              <w:left w:type="dxa" w:w="110"/>
+              <w:bottom w:type="dxa" w:w="70"/>
+              <w:right w:type="dxa" w:w="110"/>
+            </w:tcMar>
+          </w:tcPr>
+          <w:p>
+            <w:r>
+              <w:rPr>
+                <w:rFonts w:ascii="Arial" w:cs="Arial" w:eastAsia="Arial" w:hAnsi="Arial"/>
+                <w:sz w:val="20"/>
+                <w:szCs w:val="20"/>
+              </w:rPr>
+              <w:t xml:space="preserve">1,41 / 0,98</w:t>
+            </w:r>
+          </w:p>
+        </w:tc>
+        <w:tc>
+          <w:tcPr>
+            <w:tcW w:type="dxa" w:w="2057"/>
+            <w:tcBorders>
+              <w:top w:val="single" w:color="BBBBBB" w:sz="4"/>
+              <w:left w:val="single" w:color="BBBBBB" w:sz="4"/>
+              <w:bottom w:val="single" w:color="BBBBBB" w:sz="4"/>
+              <w:right w:val="single" w:color="BBBBBB" w:sz="4"/>
+            </w:tcBorders>
+            <w:tcMar>
+              <w:top w:type="dxa" w:w="70"/>
+              <w:left w:type="dxa" w:w="110"/>
+              <w:bottom w:type="dxa" w:w="70"/>
+              <w:right w:type="dxa" w:w="110"/>
+            </w:tcMar>
+          </w:tcPr>
+          <w:p>
+            <w:r>
+              <w:rPr>
+                <w:rFonts w:ascii="Arial" w:cs="Arial" w:eastAsia="Arial" w:hAnsi="Arial"/>
+                <w:sz w:val="20"/>
+                <w:szCs w:val="20"/>
+              </w:rPr>
+              <w:t xml:space="preserve">2,10 / 1,24</w:t>
+            </w:r>
+          </w:p>
+        </w:tc>
+        <w:tc>
+          <w:tcPr>
+            <w:tcW w:type="dxa" w:w="2055"/>
+            <w:tcBorders>
+              <w:top w:val="single" w:color="BBBBBB" w:sz="4"/>
+              <w:left w:val="single" w:color="BBBBBB" w:sz="4"/>
+              <w:bottom w:val="single" w:color="BBBBBB" w:sz="4"/>
+              <w:right w:val="single" w:color="BBBBBB" w:sz="4"/>
+            </w:tcBorders>
+            <w:tcMar>
+              <w:top w:type="dxa" w:w="70"/>
+              <w:left w:type="dxa" w:w="110"/>
+              <w:bottom w:type="dxa" w:w="70"/>
+              <w:right w:type="dxa" w:w="110"/>
+            </w:tcMar>
+          </w:tcPr>
+          <w:p>
+            <w:r>
+              <w:rPr>
+                <w:rFonts w:ascii="Arial" w:cs="Arial" w:eastAsia="Arial" w:hAnsi="Arial"/>
+                <w:sz w:val="20"/>
+                <w:szCs w:val="20"/>
+              </w:rPr>
+              <w:t xml:space="preserve">1,34 / 0,93</w:t>
             </w:r>
           </w:p>
         </w:tc>
@@ -5476,109 +6520,109 @@
         </w:tc>
         <w:tc>
           <w:tcPr>
-            <w:tcW w:type="dxa" w:w="800"/>
-            <w:tcBorders>
-              <w:top w:val="single" w:color="BBBBBB" w:sz="4"/>
-              <w:left w:val="single" w:color="BBBBBB" w:sz="4"/>
-              <w:bottom w:val="single" w:color="BBBBBB" w:sz="4"/>
-              <w:right w:val="single" w:color="BBBBBB" w:sz="4"/>
-            </w:tcBorders>
-            <w:tcMar>
-              <w:top w:type="dxa" w:w="70"/>
-              <w:left w:type="dxa" w:w="110"/>
-              <w:bottom w:type="dxa" w:w="70"/>
-              <w:right w:type="dxa" w:w="110"/>
-            </w:tcMar>
-          </w:tcPr>
-          <w:p>
-            <w:r>
-              <w:rPr>
-                <w:rFonts w:ascii="Arial" w:cs="Arial" w:eastAsia="Arial" w:hAnsi="Arial"/>
-                <w:sz w:val="20"/>
-                <w:szCs w:val="20"/>
-              </w:rPr>
-              <w:t xml:space="preserve">1,01</w:t>
-            </w:r>
-          </w:p>
-        </w:tc>
-        <w:tc>
-          <w:tcPr>
-            <w:tcW w:type="dxa" w:w="935"/>
-            <w:tcBorders>
-              <w:top w:val="single" w:color="BBBBBB" w:sz="4"/>
-              <w:left w:val="single" w:color="BBBBBB" w:sz="4"/>
-              <w:bottom w:val="single" w:color="BBBBBB" w:sz="4"/>
-              <w:right w:val="single" w:color="BBBBBB" w:sz="4"/>
-            </w:tcBorders>
-            <w:tcMar>
-              <w:top w:type="dxa" w:w="70"/>
-              <w:left w:type="dxa" w:w="110"/>
-              <w:bottom w:type="dxa" w:w="70"/>
-              <w:right w:type="dxa" w:w="110"/>
-            </w:tcMar>
-          </w:tcPr>
-          <w:p>
-            <w:r>
-              <w:rPr>
-                <w:rFonts w:ascii="Arial" w:cs="Arial" w:eastAsia="Arial" w:hAnsi="Arial"/>
-                <w:sz w:val="20"/>
-                <w:szCs w:val="20"/>
-              </w:rPr>
-              <w:t xml:space="preserve">1,34</w:t>
-            </w:r>
-          </w:p>
-        </w:tc>
-        <w:tc>
-          <w:tcPr>
-            <w:tcW w:type="dxa" w:w="935"/>
-            <w:tcBorders>
-              <w:top w:val="single" w:color="BBBBBB" w:sz="4"/>
-              <w:left w:val="single" w:color="BBBBBB" w:sz="4"/>
-              <w:bottom w:val="single" w:color="BBBBBB" w:sz="4"/>
-              <w:right w:val="single" w:color="BBBBBB" w:sz="4"/>
-            </w:tcBorders>
-            <w:tcMar>
-              <w:top w:type="dxa" w:w="70"/>
-              <w:left w:type="dxa" w:w="110"/>
-              <w:bottom w:type="dxa" w:w="70"/>
-              <w:right w:type="dxa" w:w="110"/>
-            </w:tcMar>
-          </w:tcPr>
-          <w:p>
-            <w:r>
-              <w:rPr>
-                <w:rFonts w:ascii="Arial" w:cs="Arial" w:eastAsia="Arial" w:hAnsi="Arial"/>
-                <w:sz w:val="20"/>
-                <w:szCs w:val="20"/>
-              </w:rPr>
-              <w:t xml:space="preserve">1,71</w:t>
-            </w:r>
-          </w:p>
-        </w:tc>
-        <w:tc>
-          <w:tcPr>
-            <w:tcW w:type="dxa" w:w="5421"/>
-            <w:tcBorders>
-              <w:top w:val="single" w:color="BBBBBB" w:sz="4"/>
-              <w:left w:val="single" w:color="BBBBBB" w:sz="4"/>
-              <w:bottom w:val="single" w:color="BBBBBB" w:sz="4"/>
-              <w:right w:val="single" w:color="BBBBBB" w:sz="4"/>
-            </w:tcBorders>
-            <w:tcMar>
-              <w:top w:type="dxa" w:w="70"/>
-              <w:left w:type="dxa" w:w="110"/>
-              <w:bottom w:type="dxa" w:w="70"/>
-              <w:right w:type="dxa" w:w="110"/>
-            </w:tcMar>
-          </w:tcPr>
-          <w:p>
-            <w:r>
-              <w:rPr>
-                <w:rFonts w:ascii="Arial" w:cs="Arial" w:eastAsia="Arial" w:hAnsi="Arial"/>
-                <w:sz w:val="20"/>
-                <w:szCs w:val="20"/>
-              </w:rPr>
-              <w:t xml:space="preserve">1,97</w:t>
+            <w:tcW w:type="dxa" w:w="1922"/>
+            <w:tcBorders>
+              <w:top w:val="single" w:color="BBBBBB" w:sz="4"/>
+              <w:left w:val="single" w:color="BBBBBB" w:sz="4"/>
+              <w:bottom w:val="single" w:color="BBBBBB" w:sz="4"/>
+              <w:right w:val="single" w:color="BBBBBB" w:sz="4"/>
+            </w:tcBorders>
+            <w:tcMar>
+              <w:top w:type="dxa" w:w="70"/>
+              <w:left w:type="dxa" w:w="110"/>
+              <w:bottom w:type="dxa" w:w="70"/>
+              <w:right w:type="dxa" w:w="110"/>
+            </w:tcMar>
+          </w:tcPr>
+          <w:p>
+            <w:r>
+              <w:rPr>
+                <w:rFonts w:ascii="Arial" w:cs="Arial" w:eastAsia="Arial" w:hAnsi="Arial"/>
+                <w:sz w:val="20"/>
+                <w:szCs w:val="20"/>
+              </w:rPr>
+              <w:t xml:space="preserve">1,01 / 0,77</w:t>
+            </w:r>
+          </w:p>
+        </w:tc>
+        <w:tc>
+          <w:tcPr>
+            <w:tcW w:type="dxa" w:w="2057"/>
+            <w:tcBorders>
+              <w:top w:val="single" w:color="BBBBBB" w:sz="4"/>
+              <w:left w:val="single" w:color="BBBBBB" w:sz="4"/>
+              <w:bottom w:val="single" w:color="BBBBBB" w:sz="4"/>
+              <w:right w:val="single" w:color="BBBBBB" w:sz="4"/>
+            </w:tcBorders>
+            <w:tcMar>
+              <w:top w:type="dxa" w:w="70"/>
+              <w:left w:type="dxa" w:w="110"/>
+              <w:bottom w:type="dxa" w:w="70"/>
+              <w:right w:type="dxa" w:w="110"/>
+            </w:tcMar>
+          </w:tcPr>
+          <w:p>
+            <w:r>
+              <w:rPr>
+                <w:rFonts w:ascii="Arial" w:cs="Arial" w:eastAsia="Arial" w:hAnsi="Arial"/>
+                <w:sz w:val="20"/>
+                <w:szCs w:val="20"/>
+              </w:rPr>
+              <w:t xml:space="preserve">1,34 / 0,84</w:t>
+            </w:r>
+          </w:p>
+        </w:tc>
+        <w:tc>
+          <w:tcPr>
+            <w:tcW w:type="dxa" w:w="2057"/>
+            <w:tcBorders>
+              <w:top w:val="single" w:color="BBBBBB" w:sz="4"/>
+              <w:left w:val="single" w:color="BBBBBB" w:sz="4"/>
+              <w:bottom w:val="single" w:color="BBBBBB" w:sz="4"/>
+              <w:right w:val="single" w:color="BBBBBB" w:sz="4"/>
+            </w:tcBorders>
+            <w:tcMar>
+              <w:top w:type="dxa" w:w="70"/>
+              <w:left w:type="dxa" w:w="110"/>
+              <w:bottom w:type="dxa" w:w="70"/>
+              <w:right w:type="dxa" w:w="110"/>
+            </w:tcMar>
+          </w:tcPr>
+          <w:p>
+            <w:r>
+              <w:rPr>
+                <w:rFonts w:ascii="Arial" w:cs="Arial" w:eastAsia="Arial" w:hAnsi="Arial"/>
+                <w:sz w:val="20"/>
+                <w:szCs w:val="20"/>
+              </w:rPr>
+              <w:t xml:space="preserve">1,71 / 1,05</w:t>
+            </w:r>
+          </w:p>
+        </w:tc>
+        <w:tc>
+          <w:tcPr>
+            <w:tcW w:type="dxa" w:w="2055"/>
+            <w:tcBorders>
+              <w:top w:val="single" w:color="BBBBBB" w:sz="4"/>
+              <w:left w:val="single" w:color="BBBBBB" w:sz="4"/>
+              <w:bottom w:val="single" w:color="BBBBBB" w:sz="4"/>
+              <w:right w:val="single" w:color="BBBBBB" w:sz="4"/>
+            </w:tcBorders>
+            <w:tcMar>
+              <w:top w:type="dxa" w:w="70"/>
+              <w:left w:type="dxa" w:w="110"/>
+              <w:bottom w:type="dxa" w:w="70"/>
+              <w:right w:type="dxa" w:w="110"/>
+            </w:tcMar>
+          </w:tcPr>
+          <w:p>
+            <w:r>
+              <w:rPr>
+                <w:rFonts w:ascii="Arial" w:cs="Arial" w:eastAsia="Arial" w:hAnsi="Arial"/>
+                <w:sz w:val="20"/>
+                <w:szCs w:val="20"/>
+              </w:rPr>
+              <w:t xml:space="preserve">1,97 / 1,35</w:t>
             </w:r>
           </w:p>
         </w:tc>
@@ -5616,109 +6660,109 @@
         </w:tc>
         <w:tc>
           <w:tcPr>
-            <w:tcW w:type="dxa" w:w="800"/>
-            <w:tcBorders>
-              <w:top w:val="single" w:color="BBBBBB" w:sz="4"/>
-              <w:left w:val="single" w:color="BBBBBB" w:sz="4"/>
-              <w:bottom w:val="single" w:color="BBBBBB" w:sz="4"/>
-              <w:right w:val="single" w:color="BBBBBB" w:sz="4"/>
-            </w:tcBorders>
-            <w:tcMar>
-              <w:top w:type="dxa" w:w="70"/>
-              <w:left w:type="dxa" w:w="110"/>
-              <w:bottom w:type="dxa" w:w="70"/>
-              <w:right w:type="dxa" w:w="110"/>
-            </w:tcMar>
-          </w:tcPr>
-          <w:p>
-            <w:r>
-              <w:rPr>
-                <w:rFonts w:ascii="Arial" w:cs="Arial" w:eastAsia="Arial" w:hAnsi="Arial"/>
-                <w:sz w:val="20"/>
-                <w:szCs w:val="20"/>
-              </w:rPr>
-              <w:t xml:space="preserve">9,23</w:t>
-            </w:r>
-          </w:p>
-        </w:tc>
-        <w:tc>
-          <w:tcPr>
-            <w:tcW w:type="dxa" w:w="935"/>
-            <w:tcBorders>
-              <w:top w:val="single" w:color="BBBBBB" w:sz="4"/>
-              <w:left w:val="single" w:color="BBBBBB" w:sz="4"/>
-              <w:bottom w:val="single" w:color="BBBBBB" w:sz="4"/>
-              <w:right w:val="single" w:color="BBBBBB" w:sz="4"/>
-            </w:tcBorders>
-            <w:tcMar>
-              <w:top w:type="dxa" w:w="70"/>
-              <w:left w:type="dxa" w:w="110"/>
-              <w:bottom w:type="dxa" w:w="70"/>
-              <w:right w:type="dxa" w:w="110"/>
-            </w:tcMar>
-          </w:tcPr>
-          <w:p>
-            <w:r>
-              <w:rPr>
-                <w:rFonts w:ascii="Arial" w:cs="Arial" w:eastAsia="Arial" w:hAnsi="Arial"/>
-                <w:sz w:val="20"/>
-                <w:szCs w:val="20"/>
-              </w:rPr>
-              <w:t xml:space="preserve">11,20</w:t>
-            </w:r>
-          </w:p>
-        </w:tc>
-        <w:tc>
-          <w:tcPr>
-            <w:tcW w:type="dxa" w:w="935"/>
-            <w:tcBorders>
-              <w:top w:val="single" w:color="BBBBBB" w:sz="4"/>
-              <w:left w:val="single" w:color="BBBBBB" w:sz="4"/>
-              <w:bottom w:val="single" w:color="BBBBBB" w:sz="4"/>
-              <w:right w:val="single" w:color="BBBBBB" w:sz="4"/>
-            </w:tcBorders>
-            <w:tcMar>
-              <w:top w:type="dxa" w:w="70"/>
-              <w:left w:type="dxa" w:w="110"/>
-              <w:bottom w:type="dxa" w:w="70"/>
-              <w:right w:type="dxa" w:w="110"/>
-            </w:tcMar>
-          </w:tcPr>
-          <w:p>
-            <w:r>
-              <w:rPr>
-                <w:rFonts w:ascii="Arial" w:cs="Arial" w:eastAsia="Arial" w:hAnsi="Arial"/>
-                <w:sz w:val="20"/>
-                <w:szCs w:val="20"/>
-              </w:rPr>
-              <w:t xml:space="preserve">16,11</w:t>
-            </w:r>
-          </w:p>
-        </w:tc>
-        <w:tc>
-          <w:tcPr>
-            <w:tcW w:type="dxa" w:w="5421"/>
-            <w:tcBorders>
-              <w:top w:val="single" w:color="BBBBBB" w:sz="4"/>
-              <w:left w:val="single" w:color="BBBBBB" w:sz="4"/>
-              <w:bottom w:val="single" w:color="BBBBBB" w:sz="4"/>
-              <w:right w:val="single" w:color="BBBBBB" w:sz="4"/>
-            </w:tcBorders>
-            <w:tcMar>
-              <w:top w:type="dxa" w:w="70"/>
-              <w:left w:type="dxa" w:w="110"/>
-              <w:bottom w:type="dxa" w:w="70"/>
-              <w:right w:type="dxa" w:w="110"/>
-            </w:tcMar>
-          </w:tcPr>
-          <w:p>
-            <w:r>
-              <w:rPr>
-                <w:rFonts w:ascii="Arial" w:cs="Arial" w:eastAsia="Arial" w:hAnsi="Arial"/>
-                <w:sz w:val="20"/>
-                <w:szCs w:val="20"/>
-              </w:rPr>
-              <w:t xml:space="preserve">13,89</w:t>
+            <w:tcW w:type="dxa" w:w="1922"/>
+            <w:tcBorders>
+              <w:top w:val="single" w:color="BBBBBB" w:sz="4"/>
+              <w:left w:val="single" w:color="BBBBBB" w:sz="4"/>
+              <w:bottom w:val="single" w:color="BBBBBB" w:sz="4"/>
+              <w:right w:val="single" w:color="BBBBBB" w:sz="4"/>
+            </w:tcBorders>
+            <w:tcMar>
+              <w:top w:type="dxa" w:w="70"/>
+              <w:left w:type="dxa" w:w="110"/>
+              <w:bottom w:type="dxa" w:w="70"/>
+              <w:right w:type="dxa" w:w="110"/>
+            </w:tcMar>
+          </w:tcPr>
+          <w:p>
+            <w:r>
+              <w:rPr>
+                <w:rFonts w:ascii="Arial" w:cs="Arial" w:eastAsia="Arial" w:hAnsi="Arial"/>
+                <w:sz w:val="20"/>
+                <w:szCs w:val="20"/>
+              </w:rPr>
+              <w:t xml:space="preserve">9,23 / 6,63</w:t>
+            </w:r>
+          </w:p>
+        </w:tc>
+        <w:tc>
+          <w:tcPr>
+            <w:tcW w:type="dxa" w:w="2057"/>
+            <w:tcBorders>
+              <w:top w:val="single" w:color="BBBBBB" w:sz="4"/>
+              <w:left w:val="single" w:color="BBBBBB" w:sz="4"/>
+              <w:bottom w:val="single" w:color="BBBBBB" w:sz="4"/>
+              <w:right w:val="single" w:color="BBBBBB" w:sz="4"/>
+            </w:tcBorders>
+            <w:tcMar>
+              <w:top w:type="dxa" w:w="70"/>
+              <w:left w:type="dxa" w:w="110"/>
+              <w:bottom w:type="dxa" w:w="70"/>
+              <w:right w:type="dxa" w:w="110"/>
+            </w:tcMar>
+          </w:tcPr>
+          <w:p>
+            <w:r>
+              <w:rPr>
+                <w:rFonts w:ascii="Arial" w:cs="Arial" w:eastAsia="Arial" w:hAnsi="Arial"/>
+                <w:sz w:val="20"/>
+                <w:szCs w:val="20"/>
+              </w:rPr>
+              <w:t xml:space="preserve">11,20 / 7,24</w:t>
+            </w:r>
+          </w:p>
+        </w:tc>
+        <w:tc>
+          <w:tcPr>
+            <w:tcW w:type="dxa" w:w="2057"/>
+            <w:tcBorders>
+              <w:top w:val="single" w:color="BBBBBB" w:sz="4"/>
+              <w:left w:val="single" w:color="BBBBBB" w:sz="4"/>
+              <w:bottom w:val="single" w:color="BBBBBB" w:sz="4"/>
+              <w:right w:val="single" w:color="BBBBBB" w:sz="4"/>
+            </w:tcBorders>
+            <w:tcMar>
+              <w:top w:type="dxa" w:w="70"/>
+              <w:left w:type="dxa" w:w="110"/>
+              <w:bottom w:type="dxa" w:w="70"/>
+              <w:right w:type="dxa" w:w="110"/>
+            </w:tcMar>
+          </w:tcPr>
+          <w:p>
+            <w:r>
+              <w:rPr>
+                <w:rFonts w:ascii="Arial" w:cs="Arial" w:eastAsia="Arial" w:hAnsi="Arial"/>
+                <w:sz w:val="20"/>
+                <w:szCs w:val="20"/>
+              </w:rPr>
+              <w:t xml:space="preserve">16,11 / 9,90</w:t>
+            </w:r>
+          </w:p>
+        </w:tc>
+        <w:tc>
+          <w:tcPr>
+            <w:tcW w:type="dxa" w:w="2055"/>
+            <w:tcBorders>
+              <w:top w:val="single" w:color="BBBBBB" w:sz="4"/>
+              <w:left w:val="single" w:color="BBBBBB" w:sz="4"/>
+              <w:bottom w:val="single" w:color="BBBBBB" w:sz="4"/>
+              <w:right w:val="single" w:color="BBBBBB" w:sz="4"/>
+            </w:tcBorders>
+            <w:tcMar>
+              <w:top w:type="dxa" w:w="70"/>
+              <w:left w:type="dxa" w:w="110"/>
+              <w:bottom w:type="dxa" w:w="70"/>
+              <w:right w:type="dxa" w:w="110"/>
+            </w:tcMar>
+          </w:tcPr>
+          <w:p>
+            <w:r>
+              <w:rPr>
+                <w:rFonts w:ascii="Arial" w:cs="Arial" w:eastAsia="Arial" w:hAnsi="Arial"/>
+                <w:sz w:val="20"/>
+                <w:szCs w:val="20"/>
+              </w:rPr>
+              <w:t xml:space="preserve">13,89 / 8,98</w:t>
             </w:r>
           </w:p>
         </w:tc>
@@ -5739,7 +6783,20 @@
           <w:sz w:val="22"/>
           <w:szCs w:val="22"/>
         </w:rPr>
-        <w:t xml:space="preserve">Користувач завантажує файли лише одного формату. Наступне відео починає завантажуватися заздалегідь, поки відтворюється поточне.</w:t>
+        <w:t xml:space="preserve">Версія 720 легша за 1080 на 28–39 % залежно від формату. Поріг якості для обох розмірів однаковий.</w:t>
+      </w:r>
+    </w:p>
+    <w:p>
+      <w:pPr>
+        <w:spacing w:after="140" w:line="300"/>
+      </w:pPr>
+      <w:r>
+        <w:rPr>
+          <w:rFonts w:ascii="Arial" w:cs="Arial" w:eastAsia="Arial" w:hAnsi="Arial"/>
+          <w:sz w:val="22"/>
+          <w:szCs w:val="22"/>
+        </w:rPr>
+        <w:t xml:space="preserve">Користувач завантажує файли лише одного розміру й одного формату. Наступне відео починає завантажуватися заздалегідь, поки відтворюється поточне.</w:t>
       </w:r>
     </w:p>
     <w:p>
@@ -6003,7 +7060,7 @@
           <w:sz w:val="22"/>
           <w:szCs w:val="22"/>
         </w:rPr>
-        <w:t xml:space="preserve"> з 28 відеофайлами, скриптом і стилями.</w:t>
+        <w:t xml:space="preserve"> з 56 відеофайлами (7 слайдів × 2 розміри × 4 формати), скриптом і стилями.</w:t>
       </w:r>
     </w:p>
     <w:p>
@@ -6310,6 +7367,17 @@
     </w:p>
     <w:p>
       <w:pPr>
+        <w:pStyle w:val="Heading1"/>
+      </w:pPr>
+      <w:r>
+        <w:rPr>
+          <w:rFonts w:ascii="Arial" w:cs="Arial" w:eastAsia="Arial" w:hAnsi="Arial"/>
+        </w:rPr>
+        <w:t xml:space="preserve">Підготовка відео</w:t>
+      </w:r>
+    </w:p>
+    <w:p>
+      <w:pPr>
         <w:spacing w:after="140" w:line="300"/>
       </w:pPr>
       <w:r>
@@ -6335,7 +7403,7 @@
           <w:sz w:val="22"/>
           <w:szCs w:val="22"/>
         </w:rPr>
-        <w:t xml:space="preserve">. Повторне кодування з вихідних файлів дизайнера виконує </w:t>
+        <w:t xml:space="preserve">. Їх створює скрипт </w:t>
       </w:r>
       <w:r>
         <w:rPr>
@@ -6344,43 +7412,30 @@
           <w:szCs w:val="22"/>
           <w:shd w:fill="F0F0F0" w:val="clear"/>
         </w:rPr>
-        <w:t xml:space="preserve">npm run video:encode -- --src &lt;папка з вихідними файлами&gt;</w:t>
-      </w:r>
-      <w:r>
-        <w:rPr>
-          <w:rFonts w:ascii="Arial" w:cs="Arial" w:eastAsia="Arial" w:hAnsi="Arial"/>
-          <w:sz w:val="22"/>
-          <w:szCs w:val="22"/>
-        </w:rPr>
-        <w:t xml:space="preserve">; параметри та результати кодування записано у </w:t>
-      </w:r>
+        <w:t xml:space="preserve">scripts/encode-story-videos.mjs</w:t>
+      </w:r>
+      <w:r>
+        <w:rPr>
+          <w:rFonts w:ascii="Arial" w:cs="Arial" w:eastAsia="Arial" w:hAnsi="Arial"/>
+          <w:sz w:val="22"/>
+          <w:szCs w:val="22"/>
+        </w:rPr>
+        <w:t xml:space="preserve"> з вихідних файлів дизайнера:</w:t>
+      </w:r>
+    </w:p>
+    <w:p>
+      <w:pPr>
+        <w:shd w:fill="F4F4F4" w:val="clear"/>
+        <w:spacing w:after="160" w:before="80" w:line="260"/>
+        <w:ind w:left="140"/>
+      </w:pPr>
       <w:r>
         <w:rPr>
           <w:rFonts w:ascii="Menlo" w:cs="Menlo" w:eastAsia="Menlo" w:hAnsi="Menlo"/>
-          <w:sz w:val="22"/>
-          <w:szCs w:val="22"/>
-          <w:shd w:fill="F0F0F0" w:val="clear"/>
-        </w:rPr>
-        <w:t xml:space="preserve">docs/poker-video-report.json</w:t>
-      </w:r>
-      <w:r>
-        <w:rPr>
-          <w:rFonts w:ascii="Arial" w:cs="Arial" w:eastAsia="Arial" w:hAnsi="Arial"/>
-          <w:sz w:val="22"/>
-          <w:szCs w:val="22"/>
-        </w:rPr>
-        <w:t xml:space="preserve">.</w:t>
-      </w:r>
-    </w:p>
-    <w:p>
-      <w:pPr>
-        <w:pStyle w:val="Heading1"/>
-      </w:pPr>
-      <w:r>
-        <w:rPr>
-          <w:rFonts w:ascii="Arial" w:cs="Arial" w:eastAsia="Arial" w:hAnsi="Arial"/>
-        </w:rPr>
-        <w:t xml:space="preserve">Перевірка</w:t>
+          <w:sz w:val="17"/>
+          <w:szCs w:val="17"/>
+        </w:rPr>
+        <w:t xml:space="preserve">npm run video:encode -- --src &lt;папка з вихідними файлами&gt; --jobs 1</w:t>
       </w:r>
     </w:p>
     <w:p>
@@ -6398,7 +7453,7 @@
           <w:sz w:val="22"/>
           <w:szCs w:val="22"/>
         </w:rPr>
-        <w:t xml:space="preserve">Сторіс відкривається за посиланням із </w:t>
+        <w:t xml:space="preserve">Вихідні файли — по одному MP4 на слайд, 1080×1920, з назвою за номером слайда: </w:t>
       </w:r>
       <w:r>
         <w:rPr>
@@ -6407,15 +7462,49 @@
           <w:szCs w:val="22"/>
           <w:shd w:fill="F0F0F0" w:val="clear"/>
         </w:rPr>
-        <w:t xml:space="preserve">user_language</w:t>
-      </w:r>
-      <w:r>
-        <w:rPr>
-          <w:rFonts w:ascii="Arial" w:cs="Arial" w:eastAsia="Arial" w:hAnsi="Arial"/>
-          <w:sz w:val="22"/>
-          <w:szCs w:val="22"/>
-        </w:rPr>
-        <w:t xml:space="preserve"> для кожної з 6 мов; тексти відповідають мові.</w:t>
+        <w:t xml:space="preserve">1.mp4</w:t>
+      </w:r>
+      <w:r>
+        <w:rPr>
+          <w:rFonts w:ascii="Arial" w:cs="Arial" w:eastAsia="Arial" w:hAnsi="Arial"/>
+          <w:sz w:val="22"/>
+          <w:szCs w:val="22"/>
+        </w:rPr>
+        <w:t xml:space="preserve">, </w:t>
+      </w:r>
+      <w:r>
+        <w:rPr>
+          <w:rFonts w:ascii="Menlo" w:cs="Menlo" w:eastAsia="Menlo" w:hAnsi="Menlo"/>
+          <w:sz w:val="22"/>
+          <w:szCs w:val="22"/>
+          <w:shd w:fill="F0F0F0" w:val="clear"/>
+        </w:rPr>
+        <w:t xml:space="preserve">2.mp4</w:t>
+      </w:r>
+      <w:r>
+        <w:rPr>
+          <w:rFonts w:ascii="Arial" w:cs="Arial" w:eastAsia="Arial" w:hAnsi="Arial"/>
+          <w:sz w:val="22"/>
+          <w:szCs w:val="22"/>
+        </w:rPr>
+        <w:t xml:space="preserve">. Повторна версія називається </w:t>
+      </w:r>
+      <w:r>
+        <w:rPr>
+          <w:rFonts w:ascii="Menlo" w:cs="Menlo" w:eastAsia="Menlo" w:hAnsi="Menlo"/>
+          <w:sz w:val="22"/>
+          <w:szCs w:val="22"/>
+          <w:shd w:fill="F0F0F0" w:val="clear"/>
+        </w:rPr>
+        <w:t xml:space="preserve">2_1.mp4</w:t>
+      </w:r>
+      <w:r>
+        <w:rPr>
+          <w:rFonts w:ascii="Arial" w:cs="Arial" w:eastAsia="Arial" w:hAnsi="Arial"/>
+          <w:sz w:val="22"/>
+          <w:szCs w:val="22"/>
+        </w:rPr>
+        <w:t xml:space="preserve">; з кількох версій береться найновіша. Інші файли в папці пропускаються.</w:t>
       </w:r>
     </w:p>
     <w:p>
@@ -6433,7 +7522,210 @@
           <w:sz w:val="22"/>
           <w:szCs w:val="22"/>
         </w:rPr>
+        <w:t xml:space="preserve">Скрипт створює обидва розміри і всі чотири формати та підбирає стиснення окремо для кожного відео: найменший файл, якість якого не нижча за поріг.</w:t>
+      </w:r>
+    </w:p>
+    <w:p>
+      <w:pPr>
+        <w:pStyle w:val="ListParagraph"/>
+        <w:numPr>
+          <w:ilvl w:val="0"/>
+          <w:numId w:val="2"/>
+        </w:numPr>
+        <w:spacing w:after="60"/>
+      </w:pPr>
+      <w:r>
+        <w:rPr>
+          <w:rFonts w:ascii="Arial" w:cs="Arial" w:eastAsia="Arial" w:hAnsi="Arial"/>
+          <w:sz w:val="22"/>
+          <w:szCs w:val="22"/>
+        </w:rPr>
+        <w:t xml:space="preserve">Результати записуються у </w:t>
+      </w:r>
+      <w:r>
+        <w:rPr>
+          <w:rFonts w:ascii="Menlo" w:cs="Menlo" w:eastAsia="Menlo" w:hAnsi="Menlo"/>
+          <w:sz w:val="22"/>
+          <w:szCs w:val="22"/>
+          <w:shd w:fill="F0F0F0" w:val="clear"/>
+        </w:rPr>
+        <w:t xml:space="preserve">docs/poker-video-report.json</w:t>
+      </w:r>
+      <w:r>
+        <w:rPr>
+          <w:rFonts w:ascii="Arial" w:cs="Arial" w:eastAsia="Arial" w:hAnsi="Arial"/>
+          <w:sz w:val="22"/>
+          <w:szCs w:val="22"/>
+        </w:rPr>
+        <w:t xml:space="preserve">: вага, оцінка якості, тип джерела кожного файлу. Назва звіту береться з назви сторіс у </w:t>
+      </w:r>
+      <w:r>
+        <w:rPr>
+          <w:rFonts w:ascii="Menlo" w:cs="Menlo" w:eastAsia="Menlo" w:hAnsi="Menlo"/>
+          <w:sz w:val="22"/>
+          <w:szCs w:val="22"/>
+          <w:shd w:fill="F0F0F0" w:val="clear"/>
+        </w:rPr>
+        <w:t xml:space="preserve">src/data/stories.json</w:t>
+      </w:r>
+      <w:r>
+        <w:rPr>
+          <w:rFonts w:ascii="Arial" w:cs="Arial" w:eastAsia="Arial" w:hAnsi="Arial"/>
+          <w:sz w:val="22"/>
+          <w:szCs w:val="22"/>
+        </w:rPr>
+        <w:t xml:space="preserve">.</w:t>
+      </w:r>
+    </w:p>
+    <w:p>
+      <w:pPr>
+        <w:pStyle w:val="ListParagraph"/>
+        <w:numPr>
+          <w:ilvl w:val="0"/>
+          <w:numId w:val="2"/>
+        </w:numPr>
+        <w:spacing w:after="60"/>
+      </w:pPr>
+      <w:r>
+        <w:rPr>
+          <w:rFonts w:ascii="Arial" w:cs="Arial" w:eastAsia="Arial" w:hAnsi="Arial"/>
+          <w:sz w:val="22"/>
+          <w:szCs w:val="22"/>
+        </w:rPr>
+        <w:t xml:space="preserve">Потрібен ffmpeg з кодеками AV1, H.265, VP9, H.264, Opus і VMAF (</w:t>
+      </w:r>
+      <w:r>
+        <w:rPr>
+          <w:rFonts w:ascii="Menlo" w:cs="Menlo" w:eastAsia="Menlo" w:hAnsi="Menlo"/>
+          <w:sz w:val="22"/>
+          <w:szCs w:val="22"/>
+          <w:shd w:fill="F0F0F0" w:val="clear"/>
+        </w:rPr>
+        <w:t xml:space="preserve">brew install ffmpeg</w:t>
+      </w:r>
+      <w:r>
+        <w:rPr>
+          <w:rFonts w:ascii="Arial" w:cs="Arial" w:eastAsia="Arial" w:hAnsi="Arial"/>
+          <w:sz w:val="22"/>
+          <w:szCs w:val="22"/>
+        </w:rPr>
+        <w:t xml:space="preserve">).</w:t>
+      </w:r>
+    </w:p>
+    <w:p>
+      <w:pPr>
+        <w:pStyle w:val="Heading1"/>
+      </w:pPr>
+      <w:r>
+        <w:rPr>
+          <w:rFonts w:ascii="Arial" w:cs="Arial" w:eastAsia="Arial" w:hAnsi="Arial"/>
+        </w:rPr>
+        <w:t xml:space="preserve">Перевірка</w:t>
+      </w:r>
+    </w:p>
+    <w:p>
+      <w:pPr>
+        <w:pStyle w:val="ListParagraph"/>
+        <w:numPr>
+          <w:ilvl w:val="0"/>
+          <w:numId w:val="2"/>
+        </w:numPr>
+        <w:spacing w:after="60"/>
+      </w:pPr>
+      <w:r>
+        <w:rPr>
+          <w:rFonts w:ascii="Arial" w:cs="Arial" w:eastAsia="Arial" w:hAnsi="Arial"/>
+          <w:sz w:val="22"/>
+          <w:szCs w:val="22"/>
+        </w:rPr>
+        <w:t xml:space="preserve">Сторіс відкривається за посиланням із </w:t>
+      </w:r>
+      <w:r>
+        <w:rPr>
+          <w:rFonts w:ascii="Menlo" w:cs="Menlo" w:eastAsia="Menlo" w:hAnsi="Menlo"/>
+          <w:sz w:val="22"/>
+          <w:szCs w:val="22"/>
+          <w:shd w:fill="F0F0F0" w:val="clear"/>
+        </w:rPr>
+        <w:t xml:space="preserve">user_language</w:t>
+      </w:r>
+      <w:r>
+        <w:rPr>
+          <w:rFonts w:ascii="Arial" w:cs="Arial" w:eastAsia="Arial" w:hAnsi="Arial"/>
+          <w:sz w:val="22"/>
+          <w:szCs w:val="22"/>
+        </w:rPr>
+        <w:t xml:space="preserve"> для кожної з 6 мов; тексти відповідають мові.</w:t>
+      </w:r>
+    </w:p>
+    <w:p>
+      <w:pPr>
+        <w:pStyle w:val="ListParagraph"/>
+        <w:numPr>
+          <w:ilvl w:val="0"/>
+          <w:numId w:val="2"/>
+        </w:numPr>
+        <w:spacing w:after="60"/>
+      </w:pPr>
+      <w:r>
+        <w:rPr>
+          <w:rFonts w:ascii="Arial" w:cs="Arial" w:eastAsia="Arial" w:hAnsi="Arial"/>
+          <w:sz w:val="22"/>
+          <w:szCs w:val="22"/>
+        </w:rPr>
         <w:t xml:space="preserve">Відео запускається автоматично без звуку; кнопка звуку вмикає і вимикає звук.</w:t>
+      </w:r>
+    </w:p>
+    <w:p>
+      <w:pPr>
+        <w:pStyle w:val="ListParagraph"/>
+        <w:numPr>
+          <w:ilvl w:val="0"/>
+          <w:numId w:val="2"/>
+        </w:numPr>
+        <w:spacing w:after="60"/>
+      </w:pPr>
+      <w:r>
+        <w:rPr>
+          <w:rFonts w:ascii="Arial" w:cs="Arial" w:eastAsia="Arial" w:hAnsi="Arial"/>
+          <w:sz w:val="22"/>
+          <w:szCs w:val="22"/>
+        </w:rPr>
+        <w:t xml:space="preserve">На телефоні зі щільністю 2 і на десктопі зі звичайним монітором відтворюється файл з </w:t>
+      </w:r>
+      <w:r>
+        <w:rPr>
+          <w:rFonts w:ascii="Menlo" w:cs="Menlo" w:eastAsia="Menlo" w:hAnsi="Menlo"/>
+          <w:sz w:val="22"/>
+          <w:szCs w:val="22"/>
+          <w:shd w:fill="F0F0F0" w:val="clear"/>
+        </w:rPr>
+        <w:t xml:space="preserve">-720</w:t>
+      </w:r>
+      <w:r>
+        <w:rPr>
+          <w:rFonts w:ascii="Arial" w:cs="Arial" w:eastAsia="Arial" w:hAnsi="Arial"/>
+          <w:sz w:val="22"/>
+          <w:szCs w:val="22"/>
+        </w:rPr>
+        <w:t xml:space="preserve"> у назві; на телефоні зі щільністю 3 — файл без </w:t>
+      </w:r>
+      <w:r>
+        <w:rPr>
+          <w:rFonts w:ascii="Menlo" w:cs="Menlo" w:eastAsia="Menlo" w:hAnsi="Menlo"/>
+          <w:sz w:val="22"/>
+          <w:szCs w:val="22"/>
+          <w:shd w:fill="F0F0F0" w:val="clear"/>
+        </w:rPr>
+        <w:t xml:space="preserve">-720</w:t>
+      </w:r>
+      <w:r>
+        <w:rPr>
+          <w:rFonts w:ascii="Arial" w:cs="Arial" w:eastAsia="Arial" w:hAnsi="Arial"/>
+          <w:sz w:val="22"/>
+          <w:szCs w:val="22"/>
+        </w:rPr>
+        <w:t xml:space="preserve">.</w:t>
       </w:r>
     </w:p>
     <w:p>

</xml_diff>